<commit_message>
Report: remove standalone BPR model, keep BPR_Ultra as the only BPR model
</commit_message>
<xml_diff>
--- a/实验报告.docx
+++ b/实验报告.docx
@@ -929,34 +929,6 @@
           <w:b/>
           <w:sz w:val="21"/>
         </w:rPr>
-        <w:t>BPR (Bayesian Personalized Ranking)</w:t>
-      </w:r>
-      <w:r>
-        <w:rPr>
-          <w:rFonts w:ascii="Microsoft YaHei" w:hAnsi="Microsoft YaHei"/>
-          <w:sz w:val="21"/>
-        </w:rPr>
-        <w:t>：经典矩阵分解排序模型。通过把用户和商品映射到低维隐空间，利用对成对的正负样本建模，最大化似然概率来学习用户和商品的偏好隐向量。</w:t>
-      </w:r>
-    </w:p>
-    <w:p>
-      <w:pPr>
-        <w:pStyle w:val="ListBullet"/>
-        <w:spacing w:before="40" w:after="40"/>
-      </w:pPr>
-      <w:r>
-        <w:rPr>
-          <w:rFonts w:ascii="Microsoft YaHei" w:hAnsi="Microsoft YaHei"/>
-          <w:sz w:val="21"/>
-        </w:rPr>
-        <w:t xml:space="preserve">  </w:t>
-      </w:r>
-      <w:r>
-        <w:rPr>
-          <w:rFonts w:ascii="Microsoft YaHei" w:hAnsi="Microsoft YaHei"/>
-          <w:b/>
-          <w:sz w:val="21"/>
-        </w:rPr>
         <w:t>SASRec</w:t>
       </w:r>
       <w:r>
@@ -992,7 +964,7 @@
           <w:rFonts w:ascii="Microsoft YaHei" w:hAnsi="Microsoft YaHei"/>
           <w:sz w:val="21"/>
         </w:rPr>
-        <w:t xml:space="preserve"> 🚀：本项目 BPR 系列的最终优化模型。取消了静态用户 ID 隐向量，纯粹以用户历史序列特征（Item Embeddings）动态表征用户。核心设计：</w:t>
+        <w:t xml:space="preserve"> 🚀：基于 Bayesian Personalized Ranking 的矩阵分解排序模型的改进版。取消了静态用户 ID 隐向量，纯粹以用户历史序列特征动态表征用户。核心设计：</w:t>
       </w:r>
     </w:p>
     <w:p>
@@ -1069,14 +1041,14 @@
           <w:b/>
           <w:sz w:val="21"/>
         </w:rPr>
-        <w:t>网格搜索最优超参</w:t>
+        <w:t>大维度隐空间</w:t>
       </w:r>
       <w:r>
         <w:rPr>
           <w:rFonts w:ascii="Microsoft YaHei" w:hAnsi="Microsoft YaHei"/>
           <w:sz w:val="21"/>
         </w:rPr>
-        <w:t>：经 7 组系统性实验确定 dim=128, lr=2e-3, K=5, dropout=0.05，在 V100 GPU 上充分释放性能。</w:t>
+        <w:t>：dim=128 结合高学习率，在大规模稀疏品类上显著提升表征能力。</w:t>
       </w:r>
     </w:p>
     <w:p>
@@ -1104,7 +1076,7 @@
           <w:rFonts w:ascii="Microsoft YaHei" w:hAnsi="Microsoft YaHei"/>
           <w:sz w:val="21"/>
         </w:rPr>
-        <w:t>：物品嵌入层 5% Dropout + AdamW weight_decay=1e-6，确保大维度嵌入在稀疏数据上的泛化能力。</w:t>
+        <w:t>：物品嵌入层 5% Dropout + AdamW weight_decay=1e-6，确保泛化能力。</w:t>
       </w:r>
     </w:p>
     <w:p>
@@ -1654,7 +1626,14 @@
                 <w:b/>
                 <w:sz w:val="19"/>
               </w:rPr>
-              <w:t>BPR</w:t>
+              <w:t>BPR_Ultra</w:t>
+            </w:r>
+            <w:r>
+              <w:rPr>
+                <w:rFonts w:ascii="Microsoft YaHei" w:hAnsi="Microsoft YaHei"/>
+                <w:sz w:val="19"/>
+              </w:rPr>
+              <w:t xml:space="preserve"> 🚀</w:t>
             </w:r>
           </w:p>
         </w:tc>
@@ -1675,9 +1654,10 @@
             <w:r>
               <w:rPr>
                 <w:rFonts w:ascii="Microsoft YaHei" w:hAnsi="Microsoft YaHei"/>
-                <w:sz w:val="19"/>
-              </w:rPr>
-              <w:t>0.0155</w:t>
+                <w:b/>
+                <w:sz w:val="19"/>
+              </w:rPr>
+              <w:t>0.0209</w:t>
             </w:r>
           </w:p>
         </w:tc>
@@ -1698,9 +1678,10 @@
             <w:r>
               <w:rPr>
                 <w:rFonts w:ascii="Microsoft YaHei" w:hAnsi="Microsoft YaHei"/>
-                <w:sz w:val="19"/>
-              </w:rPr>
-              <w:t>0.0211</w:t>
+                <w:b/>
+                <w:sz w:val="19"/>
+              </w:rPr>
+              <w:t>0.0304</w:t>
             </w:r>
           </w:p>
         </w:tc>
@@ -1723,7 +1704,7 @@
                 <w:rFonts w:ascii="Microsoft YaHei" w:hAnsi="Microsoft YaHei"/>
                 <w:sz w:val="19"/>
               </w:rPr>
-              <w:t>0.0281</w:t>
+              <w:t>0.0358</w:t>
             </w:r>
           </w:p>
         </w:tc>
@@ -1744,9 +1725,10 @@
             <w:r>
               <w:rPr>
                 <w:rFonts w:ascii="Microsoft YaHei" w:hAnsi="Microsoft YaHei"/>
-                <w:sz w:val="19"/>
-              </w:rPr>
-              <w:t>0.0216</w:t>
+                <w:b/>
+                <w:sz w:val="19"/>
+              </w:rPr>
+              <w:t>0.0290</w:t>
             </w:r>
           </w:p>
         </w:tc>
@@ -1767,161 +1749,10 @@
             <w:r>
               <w:rPr>
                 <w:rFonts w:ascii="Microsoft YaHei" w:hAnsi="Microsoft YaHei"/>
-                <w:sz w:val="19"/>
-              </w:rPr>
-              <w:t>经典的协同滤波基准，泛化稳健，效果优异</w:t>
-            </w:r>
-          </w:p>
-        </w:tc>
-      </w:tr>
-      <w:tr>
-        <w:tc>
-          <w:tcPr>
-            <w:tcW w:type="dxa" w:w="1560"/>
-          </w:tcPr>
-          <w:p>
-            <w:pPr>
-              <w:jc w:val="left"/>
-            </w:pPr>
-            <w:r>
-              <w:rPr>
-                <w:rFonts w:ascii="Microsoft YaHei" w:hAnsi="Microsoft YaHei"/>
-                <w:sz w:val="19"/>
-              </w:rPr>
-            </w:r>
-            <w:r>
-              <w:rPr>
-                <w:rFonts w:ascii="Microsoft YaHei" w:hAnsi="Microsoft YaHei"/>
                 <w:b/>
                 <w:sz w:val="19"/>
               </w:rPr>
-              <w:t>BPR_Ultra</w:t>
-            </w:r>
-            <w:r>
-              <w:rPr>
-                <w:rFonts w:ascii="Microsoft YaHei" w:hAnsi="Microsoft YaHei"/>
-                <w:sz w:val="19"/>
-              </w:rPr>
-              <w:t xml:space="preserve"> 🚀</w:t>
-            </w:r>
-          </w:p>
-        </w:tc>
-        <w:tc>
-          <w:tcPr>
-            <w:tcW w:type="dxa" w:w="1560"/>
-          </w:tcPr>
-          <w:p>
-            <w:pPr>
-              <w:jc w:val="center"/>
-            </w:pPr>
-            <w:r>
-              <w:rPr>
-                <w:rFonts w:ascii="Microsoft YaHei" w:hAnsi="Microsoft YaHei"/>
-                <w:sz w:val="19"/>
-              </w:rPr>
-            </w:r>
-            <w:r>
-              <w:rPr>
-                <w:rFonts w:ascii="Microsoft YaHei" w:hAnsi="Microsoft YaHei"/>
-                <w:b/>
-                <w:sz w:val="19"/>
-              </w:rPr>
-              <w:t>0.0209</w:t>
-            </w:r>
-          </w:p>
-        </w:tc>
-        <w:tc>
-          <w:tcPr>
-            <w:tcW w:type="dxa" w:w="1560"/>
-          </w:tcPr>
-          <w:p>
-            <w:pPr>
-              <w:jc w:val="center"/>
-            </w:pPr>
-            <w:r>
-              <w:rPr>
-                <w:rFonts w:ascii="Microsoft YaHei" w:hAnsi="Microsoft YaHei"/>
-                <w:sz w:val="19"/>
-              </w:rPr>
-            </w:r>
-            <w:r>
-              <w:rPr>
-                <w:rFonts w:ascii="Microsoft YaHei" w:hAnsi="Microsoft YaHei"/>
-                <w:b/>
-                <w:sz w:val="19"/>
-              </w:rPr>
-              <w:t>0.0304</w:t>
-            </w:r>
-          </w:p>
-        </w:tc>
-        <w:tc>
-          <w:tcPr>
-            <w:tcW w:type="dxa" w:w="1560"/>
-          </w:tcPr>
-          <w:p>
-            <w:pPr>
-              <w:jc w:val="center"/>
-            </w:pPr>
-            <w:r>
-              <w:rPr>
-                <w:rFonts w:ascii="Microsoft YaHei" w:hAnsi="Microsoft YaHei"/>
-                <w:sz w:val="19"/>
-              </w:rPr>
-            </w:r>
-            <w:r>
-              <w:rPr>
-                <w:rFonts w:ascii="Microsoft YaHei" w:hAnsi="Microsoft YaHei"/>
-                <w:sz w:val="19"/>
-              </w:rPr>
-              <w:t>0.0358</w:t>
-            </w:r>
-          </w:p>
-        </w:tc>
-        <w:tc>
-          <w:tcPr>
-            <w:tcW w:type="dxa" w:w="1560"/>
-          </w:tcPr>
-          <w:p>
-            <w:pPr>
-              <w:jc w:val="center"/>
-            </w:pPr>
-            <w:r>
-              <w:rPr>
-                <w:rFonts w:ascii="Microsoft YaHei" w:hAnsi="Microsoft YaHei"/>
-                <w:sz w:val="19"/>
-              </w:rPr>
-            </w:r>
-            <w:r>
-              <w:rPr>
-                <w:rFonts w:ascii="Microsoft YaHei" w:hAnsi="Microsoft YaHei"/>
-                <w:b/>
-                <w:sz w:val="19"/>
-              </w:rPr>
-              <w:t>0.0290</w:t>
-            </w:r>
-          </w:p>
-        </w:tc>
-        <w:tc>
-          <w:tcPr>
-            <w:tcW w:type="dxa" w:w="1560"/>
-          </w:tcPr>
-          <w:p>
-            <w:pPr>
-              <w:jc w:val="center"/>
-            </w:pPr>
-            <w:r>
-              <w:rPr>
-                <w:rFonts w:ascii="Microsoft YaHei" w:hAnsi="Microsoft YaHei"/>
-                <w:sz w:val="19"/>
-              </w:rPr>
-            </w:r>
-            <w:r>
-              <w:rPr>
-                <w:rFonts w:ascii="Microsoft YaHei" w:hAnsi="Microsoft YaHei"/>
-                <w:b/>
-                <w:sz w:val="19"/>
-              </w:rPr>
-              <w:t>网格搜索最优超参，传统模型中综合最优</w:t>
+              <w:t>基于 BPR 的改进模型，传统模型中综合最优</w:t>
             </w:r>
           </w:p>
         </w:tc>
@@ -2749,123 +2580,6 @@
             <w:r>
               <w:rPr>
                 <w:rFonts w:ascii="Microsoft YaHei" w:hAnsi="Microsoft YaHei"/>
-                <w:sz w:val="19"/>
-              </w:rPr>
-              <w:t>BPR</w:t>
-            </w:r>
-          </w:p>
-        </w:tc>
-        <w:tc>
-          <w:tcPr>
-            <w:tcW w:type="dxa" w:w="1872"/>
-          </w:tcPr>
-          <w:p>
-            <w:pPr>
-              <w:jc w:val="center"/>
-            </w:pPr>
-            <w:r>
-              <w:rPr>
-                <w:rFonts w:ascii="Microsoft YaHei" w:hAnsi="Microsoft YaHei"/>
-                <w:sz w:val="19"/>
-              </w:rPr>
-            </w:r>
-            <w:r>
-              <w:rPr>
-                <w:rFonts w:ascii="Microsoft YaHei" w:hAnsi="Microsoft YaHei"/>
-                <w:sz w:val="19"/>
-              </w:rPr>
-              <w:t>0.0155</w:t>
-            </w:r>
-          </w:p>
-        </w:tc>
-        <w:tc>
-          <w:tcPr>
-            <w:tcW w:type="dxa" w:w="1872"/>
-          </w:tcPr>
-          <w:p>
-            <w:pPr>
-              <w:jc w:val="center"/>
-            </w:pPr>
-            <w:r>
-              <w:rPr>
-                <w:rFonts w:ascii="Microsoft YaHei" w:hAnsi="Microsoft YaHei"/>
-                <w:sz w:val="19"/>
-              </w:rPr>
-            </w:r>
-            <w:r>
-              <w:rPr>
-                <w:rFonts w:ascii="Microsoft YaHei" w:hAnsi="Microsoft YaHei"/>
-                <w:sz w:val="19"/>
-              </w:rPr>
-              <w:t>0.0275</w:t>
-            </w:r>
-          </w:p>
-        </w:tc>
-        <w:tc>
-          <w:tcPr>
-            <w:tcW w:type="dxa" w:w="1872"/>
-          </w:tcPr>
-          <w:p>
-            <w:pPr>
-              <w:jc w:val="center"/>
-            </w:pPr>
-            <w:r>
-              <w:rPr>
-                <w:rFonts w:ascii="Microsoft YaHei" w:hAnsi="Microsoft YaHei"/>
-                <w:sz w:val="19"/>
-              </w:rPr>
-            </w:r>
-            <w:r>
-              <w:rPr>
-                <w:rFonts w:ascii="Microsoft YaHei" w:hAnsi="Microsoft YaHei"/>
-                <w:sz w:val="19"/>
-              </w:rPr>
-              <w:t>0.0118</w:t>
-            </w:r>
-          </w:p>
-        </w:tc>
-        <w:tc>
-          <w:tcPr>
-            <w:tcW w:type="dxa" w:w="1872"/>
-          </w:tcPr>
-          <w:p>
-            <w:pPr>
-              <w:jc w:val="center"/>
-            </w:pPr>
-            <w:r>
-              <w:rPr>
-                <w:rFonts w:ascii="Microsoft YaHei" w:hAnsi="Microsoft YaHei"/>
-                <w:sz w:val="19"/>
-              </w:rPr>
-            </w:r>
-            <w:r>
-              <w:rPr>
-                <w:rFonts w:ascii="Microsoft YaHei" w:hAnsi="Microsoft YaHei"/>
-                <w:sz w:val="19"/>
-              </w:rPr>
-              <w:t>39.4s</w:t>
-            </w:r>
-          </w:p>
-        </w:tc>
-      </w:tr>
-      <w:tr>
-        <w:tc>
-          <w:tcPr>
-            <w:tcW w:type="dxa" w:w="1872"/>
-          </w:tcPr>
-          <w:p>
-            <w:pPr>
-              <w:jc w:val="left"/>
-            </w:pPr>
-            <w:r>
-              <w:rPr>
-                <w:rFonts w:ascii="Microsoft YaHei" w:hAnsi="Microsoft YaHei"/>
-                <w:sz w:val="19"/>
-              </w:rPr>
-            </w:r>
-            <w:r>
-              <w:rPr>
-                <w:rFonts w:ascii="Microsoft YaHei" w:hAnsi="Microsoft YaHei"/>
                 <w:b/>
                 <w:sz w:val="19"/>
               </w:rPr>
@@ -3711,123 +3425,6 @@
             <w:r>
               <w:rPr>
                 <w:rFonts w:ascii="Microsoft YaHei" w:hAnsi="Microsoft YaHei"/>
-                <w:sz w:val="19"/>
-              </w:rPr>
-              <w:t>BPR</w:t>
-            </w:r>
-          </w:p>
-        </w:tc>
-        <w:tc>
-          <w:tcPr>
-            <w:tcW w:type="dxa" w:w="1872"/>
-          </w:tcPr>
-          <w:p>
-            <w:pPr>
-              <w:jc w:val="center"/>
-            </w:pPr>
-            <w:r>
-              <w:rPr>
-                <w:rFonts w:ascii="Microsoft YaHei" w:hAnsi="Microsoft YaHei"/>
-                <w:sz w:val="19"/>
-              </w:rPr>
-            </w:r>
-            <w:r>
-              <w:rPr>
-                <w:rFonts w:ascii="Microsoft YaHei" w:hAnsi="Microsoft YaHei"/>
-                <w:sz w:val="19"/>
-              </w:rPr>
-              <w:t>0.0211</w:t>
-            </w:r>
-          </w:p>
-        </w:tc>
-        <w:tc>
-          <w:tcPr>
-            <w:tcW w:type="dxa" w:w="1872"/>
-          </w:tcPr>
-          <w:p>
-            <w:pPr>
-              <w:jc w:val="center"/>
-            </w:pPr>
-            <w:r>
-              <w:rPr>
-                <w:rFonts w:ascii="Microsoft YaHei" w:hAnsi="Microsoft YaHei"/>
-                <w:sz w:val="19"/>
-              </w:rPr>
-            </w:r>
-            <w:r>
-              <w:rPr>
-                <w:rFonts w:ascii="Microsoft YaHei" w:hAnsi="Microsoft YaHei"/>
-                <w:sz w:val="19"/>
-              </w:rPr>
-              <w:t>0.0384</w:t>
-            </w:r>
-          </w:p>
-        </w:tc>
-        <w:tc>
-          <w:tcPr>
-            <w:tcW w:type="dxa" w:w="1872"/>
-          </w:tcPr>
-          <w:p>
-            <w:pPr>
-              <w:jc w:val="center"/>
-            </w:pPr>
-            <w:r>
-              <w:rPr>
-                <w:rFonts w:ascii="Microsoft YaHei" w:hAnsi="Microsoft YaHei"/>
-                <w:sz w:val="19"/>
-              </w:rPr>
-            </w:r>
-            <w:r>
-              <w:rPr>
-                <w:rFonts w:ascii="Microsoft YaHei" w:hAnsi="Microsoft YaHei"/>
-                <w:sz w:val="19"/>
-              </w:rPr>
-              <w:t>0.0159</w:t>
-            </w:r>
-          </w:p>
-        </w:tc>
-        <w:tc>
-          <w:tcPr>
-            <w:tcW w:type="dxa" w:w="1872"/>
-          </w:tcPr>
-          <w:p>
-            <w:pPr>
-              <w:jc w:val="center"/>
-            </w:pPr>
-            <w:r>
-              <w:rPr>
-                <w:rFonts w:ascii="Microsoft YaHei" w:hAnsi="Microsoft YaHei"/>
-                <w:sz w:val="19"/>
-              </w:rPr>
-            </w:r>
-            <w:r>
-              <w:rPr>
-                <w:rFonts w:ascii="Microsoft YaHei" w:hAnsi="Microsoft YaHei"/>
-                <w:sz w:val="19"/>
-              </w:rPr>
-              <w:t>35.1s</w:t>
-            </w:r>
-          </w:p>
-        </w:tc>
-      </w:tr>
-      <w:tr>
-        <w:tc>
-          <w:tcPr>
-            <w:tcW w:type="dxa" w:w="1872"/>
-          </w:tcPr>
-          <w:p>
-            <w:pPr>
-              <w:jc w:val="left"/>
-            </w:pPr>
-            <w:r>
-              <w:rPr>
-                <w:rFonts w:ascii="Microsoft YaHei" w:hAnsi="Microsoft YaHei"/>
-                <w:sz w:val="19"/>
-              </w:rPr>
-            </w:r>
-            <w:r>
-              <w:rPr>
-                <w:rFonts w:ascii="Microsoft YaHei" w:hAnsi="Microsoft YaHei"/>
                 <w:b/>
                 <w:sz w:val="19"/>
               </w:rPr>
@@ -4558,123 +4155,6 @@
                 <w:rFonts w:ascii="Microsoft YaHei" w:hAnsi="Microsoft YaHei"/>
                 <w:sz w:val="19"/>
               </w:rPr>
-              <w:t>BPR</w:t>
-            </w:r>
-          </w:p>
-        </w:tc>
-        <w:tc>
-          <w:tcPr>
-            <w:tcW w:type="dxa" w:w="1872"/>
-          </w:tcPr>
-          <w:p>
-            <w:pPr>
-              <w:jc w:val="center"/>
-            </w:pPr>
-            <w:r>
-              <w:rPr>
-                <w:rFonts w:ascii="Microsoft YaHei" w:hAnsi="Microsoft YaHei"/>
-                <w:sz w:val="19"/>
-              </w:rPr>
-            </w:r>
-            <w:r>
-              <w:rPr>
-                <w:rFonts w:ascii="Microsoft YaHei" w:hAnsi="Microsoft YaHei"/>
-                <w:sz w:val="19"/>
-              </w:rPr>
-              <w:t>0.0281</w:t>
-            </w:r>
-          </w:p>
-        </w:tc>
-        <w:tc>
-          <w:tcPr>
-            <w:tcW w:type="dxa" w:w="1872"/>
-          </w:tcPr>
-          <w:p>
-            <w:pPr>
-              <w:jc w:val="center"/>
-            </w:pPr>
-            <w:r>
-              <w:rPr>
-                <w:rFonts w:ascii="Microsoft YaHei" w:hAnsi="Microsoft YaHei"/>
-                <w:sz w:val="19"/>
-              </w:rPr>
-            </w:r>
-            <w:r>
-              <w:rPr>
-                <w:rFonts w:ascii="Microsoft YaHei" w:hAnsi="Microsoft YaHei"/>
-                <w:sz w:val="19"/>
-              </w:rPr>
-              <w:t>0.0497</w:t>
-            </w:r>
-          </w:p>
-        </w:tc>
-        <w:tc>
-          <w:tcPr>
-            <w:tcW w:type="dxa" w:w="1872"/>
-          </w:tcPr>
-          <w:p>
-            <w:pPr>
-              <w:jc w:val="center"/>
-            </w:pPr>
-            <w:r>
-              <w:rPr>
-                <w:rFonts w:ascii="Microsoft YaHei" w:hAnsi="Microsoft YaHei"/>
-                <w:sz w:val="19"/>
-              </w:rPr>
-            </w:r>
-            <w:r>
-              <w:rPr>
-                <w:rFonts w:ascii="Microsoft YaHei" w:hAnsi="Microsoft YaHei"/>
-                <w:sz w:val="19"/>
-              </w:rPr>
-              <w:t>0.0215</w:t>
-            </w:r>
-          </w:p>
-        </w:tc>
-        <w:tc>
-          <w:tcPr>
-            <w:tcW w:type="dxa" w:w="1872"/>
-          </w:tcPr>
-          <w:p>
-            <w:pPr>
-              <w:jc w:val="center"/>
-            </w:pPr>
-            <w:r>
-              <w:rPr>
-                <w:rFonts w:ascii="Microsoft YaHei" w:hAnsi="Microsoft YaHei"/>
-                <w:sz w:val="19"/>
-              </w:rPr>
-            </w:r>
-            <w:r>
-              <w:rPr>
-                <w:rFonts w:ascii="Microsoft YaHei" w:hAnsi="Microsoft YaHei"/>
-                <w:sz w:val="19"/>
-              </w:rPr>
-              <w:t>118.2s</w:t>
-            </w:r>
-          </w:p>
-        </w:tc>
-      </w:tr>
-      <w:tr>
-        <w:tc>
-          <w:tcPr>
-            <w:tcW w:type="dxa" w:w="1872"/>
-          </w:tcPr>
-          <w:p>
-            <w:pPr>
-              <w:jc w:val="left"/>
-            </w:pPr>
-            <w:r>
-              <w:rPr>
-                <w:rFonts w:ascii="Microsoft YaHei" w:hAnsi="Microsoft YaHei"/>
-                <w:sz w:val="19"/>
-              </w:rPr>
-            </w:r>
-            <w:r>
-              <w:rPr>
-                <w:rFonts w:ascii="Microsoft YaHei" w:hAnsi="Microsoft YaHei"/>
-                <w:sz w:val="19"/>
-              </w:rPr>
               <w:t>BPR_Ultra 🚀</w:t>
             </w:r>
           </w:p>
@@ -5523,124 +5003,6 @@
                 <w:b/>
                 <w:sz w:val="19"/>
               </w:rPr>
-              <w:t>BPR</w:t>
-            </w:r>
-          </w:p>
-        </w:tc>
-        <w:tc>
-          <w:tcPr>
-            <w:tcW w:type="dxa" w:w="1872"/>
-          </w:tcPr>
-          <w:p>
-            <w:pPr>
-              <w:jc w:val="center"/>
-            </w:pPr>
-            <w:r>
-              <w:rPr>
-                <w:rFonts w:ascii="Microsoft YaHei" w:hAnsi="Microsoft YaHei"/>
-                <w:sz w:val="19"/>
-              </w:rPr>
-            </w:r>
-            <w:r>
-              <w:rPr>
-                <w:rFonts w:ascii="Microsoft YaHei" w:hAnsi="Microsoft YaHei"/>
-                <w:sz w:val="19"/>
-              </w:rPr>
-              <w:t>0.0210</w:t>
-            </w:r>
-          </w:p>
-        </w:tc>
-        <w:tc>
-          <w:tcPr>
-            <w:tcW w:type="dxa" w:w="1872"/>
-          </w:tcPr>
-          <w:p>
-            <w:pPr>
-              <w:jc w:val="center"/>
-            </w:pPr>
-            <w:r>
-              <w:rPr>
-                <w:rFonts w:ascii="Microsoft YaHei" w:hAnsi="Microsoft YaHei"/>
-                <w:sz w:val="19"/>
-              </w:rPr>
-            </w:r>
-            <w:r>
-              <w:rPr>
-                <w:rFonts w:ascii="Microsoft YaHei" w:hAnsi="Microsoft YaHei"/>
-                <w:sz w:val="19"/>
-              </w:rPr>
-              <w:t>0.0234</w:t>
-            </w:r>
-          </w:p>
-        </w:tc>
-        <w:tc>
-          <w:tcPr>
-            <w:tcW w:type="dxa" w:w="1872"/>
-          </w:tcPr>
-          <w:p>
-            <w:pPr>
-              <w:jc w:val="center"/>
-            </w:pPr>
-            <w:r>
-              <w:rPr>
-                <w:rFonts w:ascii="Microsoft YaHei" w:hAnsi="Microsoft YaHei"/>
-                <w:sz w:val="19"/>
-              </w:rPr>
-            </w:r>
-            <w:r>
-              <w:rPr>
-                <w:rFonts w:ascii="Microsoft YaHei" w:hAnsi="Microsoft YaHei"/>
-                <w:sz w:val="19"/>
-              </w:rPr>
-              <w:t>0.0321</w:t>
-            </w:r>
-          </w:p>
-        </w:tc>
-        <w:tc>
-          <w:tcPr>
-            <w:tcW w:type="dxa" w:w="1872"/>
-          </w:tcPr>
-          <w:p>
-            <w:pPr>
-              <w:jc w:val="center"/>
-            </w:pPr>
-            <w:r>
-              <w:rPr>
-                <w:rFonts w:ascii="Microsoft YaHei" w:hAnsi="Microsoft YaHei"/>
-                <w:sz w:val="19"/>
-              </w:rPr>
-            </w:r>
-            <w:r>
-              <w:rPr>
-                <w:rFonts w:ascii="Microsoft YaHei" w:hAnsi="Microsoft YaHei"/>
-                <w:sz w:val="19"/>
-              </w:rPr>
-              <w:t>传统模型中最稳健、拟合度最高</w:t>
-            </w:r>
-          </w:p>
-        </w:tc>
-      </w:tr>
-      <w:tr>
-        <w:tc>
-          <w:tcPr>
-            <w:tcW w:type="dxa" w:w="1872"/>
-          </w:tcPr>
-          <w:p>
-            <w:pPr>
-              <w:jc w:val="left"/>
-            </w:pPr>
-            <w:r>
-              <w:rPr>
-                <w:rFonts w:ascii="Microsoft YaHei" w:hAnsi="Microsoft YaHei"/>
-                <w:sz w:val="19"/>
-              </w:rPr>
-            </w:r>
-            <w:r>
-              <w:rPr>
-                <w:rFonts w:ascii="Microsoft YaHei" w:hAnsi="Microsoft YaHei"/>
-                <w:b/>
-                <w:sz w:val="19"/>
-              </w:rPr>
               <w:t>BPR_Ultra</w:t>
             </w:r>
             <w:r>
@@ -6135,7 +5497,7 @@
           <w:color w:val="646E78"/>
           <w:sz w:val="22"/>
         </w:rPr>
-        <w:t>4.4.1 BPR 与 BPR_Ultra 的对比分析</w:t>
+        <w:t>4.4.1 BPR_Ultra 模型分析</w:t>
       </w:r>
     </w:p>
     <w:p>
@@ -6147,7 +5509,7 @@
           <w:rFonts w:ascii="Microsoft YaHei" w:hAnsi="Microsoft YaHei"/>
           <w:sz w:val="21"/>
         </w:rPr>
-        <w:t>原版 BPR 为每个用户 ID 分配独立隐向量，BPR_Ultra 改用历史序列动态生成用户表示——长期兴趣取历史商品 embedding 的均值，短期兴趣取序列最后一项，以可学习的 σ(α) 自适应加权融合，并加入物品偏置 b_i 将静态热度与动态匹配度解耦。</w:t>
+        <w:t>BPR_Ultra 基于 Bayesian Personalized Ranking 的成对排序损失，使用历史序列动态生成用户表示——长期兴趣取历史商品 embedding 的均值，短期兴趣取序列最后一项，以 σ(α) 自适应加权融合，并加入物品偏置 b_i 将静态热度与动态匹配度解耦。</w:t>
       </w:r>
     </w:p>
     <w:p>
@@ -6159,7 +5521,7 @@
           <w:rFonts w:ascii="Microsoft YaHei" w:hAnsi="Microsoft YaHei"/>
           <w:sz w:val="21"/>
         </w:rPr>
-        <w:t xml:space="preserve">BPR_Ultra 在三个品类上均显著优于原版 BPR。在 </w:t>
+        <w:t xml:space="preserve">BPR_Ultra 在 </w:t>
       </w:r>
       <w:r>
         <w:rPr>
@@ -6174,7 +5536,7 @@
           <w:rFonts w:ascii="Microsoft YaHei" w:hAnsi="Microsoft YaHei"/>
           <w:sz w:val="21"/>
         </w:rPr>
-        <w:t xml:space="preserve"> 上 NDCG@10 从 0.0155 升至 0.0209（+34.8%），在 </w:t>
+        <w:t xml:space="preserve"> 上 NDCG@10 = 0.0209，在 </w:t>
       </w:r>
       <w:r>
         <w:rPr>
@@ -6189,7 +5551,7 @@
           <w:rFonts w:ascii="Microsoft YaHei" w:hAnsi="Microsoft YaHei"/>
           <w:sz w:val="21"/>
         </w:rPr>
-        <w:t xml:space="preserve"> 上从 0.0211 升至 0.0304（+44.1%）。这两个品类商品聚焦（电工工具、乐器配件），购买路径短期相关性强，用户两次购买之间通常存在工具链或场景关联，序列动态表示比静态 user ID 更能捕捉这种即时需求。</w:t>
+        <w:t xml:space="preserve"> 上达 0.0304。这两个品类商品聚焦（电工工具、乐器配件），购买路径短期相关性强，用户两次购买之间存在工具链或场景关联，动态序列表示能有效捕捉这种即时需求。</w:t>
       </w:r>
     </w:p>
     <w:p>
@@ -6216,7 +5578,7 @@
           <w:rFonts w:ascii="Microsoft YaHei" w:hAnsi="Microsoft YaHei"/>
           <w:sz w:val="21"/>
         </w:rPr>
-        <w:t xml:space="preserve"> 上 BPR_Ultra 的 0.0358 远超原版 BPR 的 0.0281（+27.4%），也是三个品类中绝对提升最大的。CDs 是最大最稀疏的品类（89K 物品），较大的隐空间（dim=128）提供了足够容量区分海量物品的精细差异，而较高的学习率帮助模型在稀疏梯度中快速收敛。BPR_Ultra 三品类平均 NDCG@10 为 </w:t>
+        <w:t xml:space="preserve"> 上 BPR_Ultra 达 0.0358，为三个品类中最高，逼近 LLM Zero-Shot 的 0.0373。CDs 是最大最稀疏的品类（89K 物品），较大的隐空间提供了足够容量区分海量物品的精细差异。BPR_Ultra 三品类平均 NDCG@10 为 </w:t>
       </w:r>
       <w:r>
         <w:rPr>
@@ -6243,7 +5605,7 @@
           <w:rFonts w:ascii="Microsoft YaHei" w:hAnsi="Microsoft YaHei"/>
           <w:sz w:val="21"/>
         </w:rPr>
-        <w:t>适用场景：BPR 系列适合用户交互序列可获取的推荐场景，BPR_Ultra 在品类规模较大、物品多样性高时优势更明显；如果用户交互序列过短或缺失，静态 user ID 的 BPR 仍是更稳健的选择。</w:t>
+        <w:t>适用场景：BPR_Ultra 适合用户交互序列可获取的推荐场景，在品类规模较大、物品多样性高时优势尤其明显。</w:t>
       </w:r>
     </w:p>
     <w:p>
@@ -6309,7 +5671,7 @@
           <w:rFonts w:ascii="Microsoft YaHei" w:hAnsi="Microsoft YaHei"/>
           <w:sz w:val="21"/>
         </w:rPr>
-        <w:t>理论上自注意力能捕捉长距离依赖，但 SASRec 在三个品类上都明显弱于 BPR。原因是 5-Core 数据集里多数用户的交互序列偏短，Transformer 的多头注意力和前馈层参数较多，训练信号不足以稳定收敛。BPR 的成对排序损失在每个 (user, pos, neg) 三元组上直接更新隐向量，梯度密度更高，在轻交互场景里更稳。这并非 SASRec 模型本身有问题，而是数据规模与模型容量不匹配。</w:t>
+        <w:t>理论上自注意力能捕捉长距离依赖，但 SASRec 在三个品类上都明显弱于 BPR_Ultra。原因是 5-Core 数据集里多数用户的交互序列偏短，Transformer 的多头注意力和前馈层参数较多，训练信号不足以稳定收敛。BPR_Ultra 的成对排序损失在每个三元组上直接更新隐向量，梯度密度更高，在轻交互场景里更稳。这并非 SASRec 模型本身有问题，而是数据规模与模型容量不匹配。</w:t>
       </w:r>
     </w:p>
     <w:p>
@@ -6393,7 +5755,7 @@
           <w:color w:val="34495E"/>
           <w:sz w:val="24"/>
         </w:rPr>
-        <w:t>6.1 硬件环境</w:t>
+        <w:t>5.1 硬件环境</w:t>
       </w:r>
     </w:p>
     <w:tbl>
@@ -6701,7 +6063,7 @@
           <w:color w:val="34495E"/>
           <w:sz w:val="24"/>
         </w:rPr>
-        <w:t>6.2 软件依赖</w:t>
+        <w:t>5.2 软件依赖</w:t>
       </w:r>
     </w:p>
     <w:tbl>
@@ -7153,7 +6515,7 @@
           <w:color w:val="34495E"/>
           <w:sz w:val="24"/>
         </w:rPr>
-        <w:t>6.3 超参数配置（Hyperparameters）</w:t>
+        <w:t>5.3 超参数配置（Hyperparameters）</w:t>
       </w:r>
     </w:p>
     <w:tbl>
@@ -7841,15 +7203,9 @@
         <w:br/>
         <w:t>├── dashboard_data.js                   # 供大屏双击零跨域直接读取的可视化数据文件</w:t>
         <w:br/>
-        <w:t>├── Industrial_and_Scientific_BPR_model.pt          # BPR 模型权重文件 (Industrial)</w:t>
-        <w:br/>
         <w:t>├── Industrial_and_Scientific_SASRec_model.pt       # SASRec 模型权重 (Industrial)</w:t>
         <w:br/>
-        <w:t>├── Musical_Instruments_BPR_model.pt                # BPR 模型权重文件 (Musical)</w:t>
-        <w:br/>
         <w:t>├── Musical_Instruments_SASRec_model.pt             # SASRec 模型权重 (Musical)</w:t>
-        <w:br/>
-        <w:t>├── CDs_and_Vinyl_BPR_model.pt                      # BPR 模型权重文件 (CDs)</w:t>
         <w:br/>
         <w:t>├── CDs_and_Vinyl_SASRec_model.pt                   # SASRec 模型权重 (CDs)</w:t>
         <w:br/>

</xml_diff>

<commit_message>
Report: rename BPR_Ultra to BPR, remove runtime col, remove software deps
</commit_message>
<xml_diff>
--- a/实验报告.docx
+++ b/实验报告.docx
@@ -957,7 +957,7 @@
           <w:b/>
           <w:sz w:val="21"/>
         </w:rPr>
-        <w:t>BPR_Ultra</w:t>
+        <w:t>BPR</w:t>
       </w:r>
       <w:r>
         <w:rPr>
@@ -1626,7 +1626,7 @@
                 <w:b/>
                 <w:sz w:val="19"/>
               </w:rPr>
-              <w:t>BPR_Ultra</w:t>
+              <w:t>BPR</w:t>
             </w:r>
             <w:r>
               <w:rPr>
@@ -2225,16 +2225,15 @@
         <w:tblLook w:firstColumn="1" w:firstRow="1" w:lastColumn="0" w:lastRow="0" w:noHBand="0" w:noVBand="1" w:val="04A0"/>
       </w:tblPr>
       <w:tblGrid>
-        <w:gridCol w:w="1872"/>
-        <w:gridCol w:w="1872"/>
-        <w:gridCol w:w="1872"/>
-        <w:gridCol w:w="1872"/>
-        <w:gridCol w:w="1872"/>
+        <w:gridCol w:w="2340"/>
+        <w:gridCol w:w="2340"/>
+        <w:gridCol w:w="2340"/>
+        <w:gridCol w:w="2340"/>
       </w:tblGrid>
       <w:tr>
         <w:tc>
           <w:tcPr>
-            <w:tcW w:type="dxa" w:w="1872"/>
+            <w:tcW w:type="dxa" w:w="2340"/>
           </w:tcPr>
           <w:p>
             <w:pPr>
@@ -2253,7 +2252,7 @@
         </w:tc>
         <w:tc>
           <w:tcPr>
-            <w:tcW w:type="dxa" w:w="1872"/>
+            <w:tcW w:type="dxa" w:w="2340"/>
           </w:tcPr>
           <w:p>
             <w:pPr>
@@ -2272,7 +2271,7 @@
         </w:tc>
         <w:tc>
           <w:tcPr>
-            <w:tcW w:type="dxa" w:w="1872"/>
+            <w:tcW w:type="dxa" w:w="2340"/>
           </w:tcPr>
           <w:p>
             <w:pPr>
@@ -2291,7 +2290,7 @@
         </w:tc>
         <w:tc>
           <w:tcPr>
-            <w:tcW w:type="dxa" w:w="1872"/>
+            <w:tcW w:type="dxa" w:w="2340"/>
           </w:tcPr>
           <w:p>
             <w:pPr>
@@ -2308,22 +2307,97 @@
             </w:r>
           </w:p>
         </w:tc>
+      </w:tr>
+      <w:tr>
         <w:tc>
           <w:tcPr>
-            <w:tcW w:type="dxa" w:w="1872"/>
+            <w:tcW w:type="dxa" w:w="2340"/>
+          </w:tcPr>
+          <w:p>
+            <w:pPr>
+              <w:jc w:val="left"/>
+            </w:pPr>
+            <w:r>
+              <w:rPr>
+                <w:rFonts w:ascii="Microsoft YaHei" w:hAnsi="Microsoft YaHei"/>
+                <w:sz w:val="19"/>
+              </w:rPr>
+            </w:r>
+            <w:r>
+              <w:rPr>
+                <w:rFonts w:ascii="Microsoft YaHei" w:hAnsi="Microsoft YaHei"/>
+                <w:sz w:val="19"/>
+              </w:rPr>
+              <w:t>Popularity</w:t>
+            </w:r>
+          </w:p>
+        </w:tc>
+        <w:tc>
+          <w:tcPr>
+            <w:tcW w:type="dxa" w:w="2340"/>
           </w:tcPr>
           <w:p>
             <w:pPr>
               <w:jc w:val="center"/>
             </w:pPr>
-            <w:r/>
-            <w:r>
-              <w:rPr>
-                <w:rFonts w:ascii="Microsoft YaHei" w:hAnsi="Microsoft YaHei"/>
-                <w:b/>
-                <w:sz w:val="20"/>
-              </w:rPr>
-              <w:t>运行开销 / 推理耗时</w:t>
+            <w:r>
+              <w:rPr>
+                <w:rFonts w:ascii="Microsoft YaHei" w:hAnsi="Microsoft YaHei"/>
+                <w:sz w:val="19"/>
+              </w:rPr>
+            </w:r>
+            <w:r>
+              <w:rPr>
+                <w:rFonts w:ascii="Microsoft YaHei" w:hAnsi="Microsoft YaHei"/>
+                <w:sz w:val="19"/>
+              </w:rPr>
+              <w:t>0.0081</w:t>
+            </w:r>
+          </w:p>
+        </w:tc>
+        <w:tc>
+          <w:tcPr>
+            <w:tcW w:type="dxa" w:w="2340"/>
+          </w:tcPr>
+          <w:p>
+            <w:pPr>
+              <w:jc w:val="center"/>
+            </w:pPr>
+            <w:r>
+              <w:rPr>
+                <w:rFonts w:ascii="Microsoft YaHei" w:hAnsi="Microsoft YaHei"/>
+                <w:sz w:val="19"/>
+              </w:rPr>
+            </w:r>
+            <w:r>
+              <w:rPr>
+                <w:rFonts w:ascii="Microsoft YaHei" w:hAnsi="Microsoft YaHei"/>
+                <w:sz w:val="19"/>
+              </w:rPr>
+              <w:t>0.0156</w:t>
+            </w:r>
+          </w:p>
+        </w:tc>
+        <w:tc>
+          <w:tcPr>
+            <w:tcW w:type="dxa" w:w="2340"/>
+          </w:tcPr>
+          <w:p>
+            <w:pPr>
+              <w:jc w:val="center"/>
+            </w:pPr>
+            <w:r>
+              <w:rPr>
+                <w:rFonts w:ascii="Microsoft YaHei" w:hAnsi="Microsoft YaHei"/>
+                <w:sz w:val="19"/>
+              </w:rPr>
+            </w:r>
+            <w:r>
+              <w:rPr>
+                <w:rFonts w:ascii="Microsoft YaHei" w:hAnsi="Microsoft YaHei"/>
+                <w:sz w:val="19"/>
+              </w:rPr>
+              <w:t>0.0059</w:t>
             </w:r>
           </w:p>
         </w:tc>
@@ -2331,7 +2405,7 @@
       <w:tr>
         <w:tc>
           <w:tcPr>
-            <w:tcW w:type="dxa" w:w="1872"/>
+            <w:tcW w:type="dxa" w:w="2340"/>
           </w:tcPr>
           <w:p>
             <w:pPr>
@@ -2348,13 +2422,13 @@
                 <w:rFonts w:ascii="Microsoft YaHei" w:hAnsi="Microsoft YaHei"/>
                 <w:sz w:val="19"/>
               </w:rPr>
-              <w:t>Popularity</w:t>
+              <w:t>ItemCF</w:t>
             </w:r>
           </w:p>
         </w:tc>
         <w:tc>
           <w:tcPr>
-            <w:tcW w:type="dxa" w:w="1872"/>
+            <w:tcW w:type="dxa" w:w="2340"/>
           </w:tcPr>
           <w:p>
             <w:pPr>
@@ -2371,13 +2445,13 @@
                 <w:rFonts w:ascii="Microsoft YaHei" w:hAnsi="Microsoft YaHei"/>
                 <w:sz w:val="19"/>
               </w:rPr>
-              <w:t>0.0081</w:t>
+              <w:t>0.0050</w:t>
             </w:r>
           </w:p>
         </w:tc>
         <w:tc>
           <w:tcPr>
-            <w:tcW w:type="dxa" w:w="1872"/>
+            <w:tcW w:type="dxa" w:w="2340"/>
           </w:tcPr>
           <w:p>
             <w:pPr>
@@ -2394,13 +2468,13 @@
                 <w:rFonts w:ascii="Microsoft YaHei" w:hAnsi="Microsoft YaHei"/>
                 <w:sz w:val="19"/>
               </w:rPr>
-              <w:t>0.0156</w:t>
+              <w:t>0.0082</w:t>
             </w:r>
           </w:p>
         </w:tc>
         <w:tc>
           <w:tcPr>
-            <w:tcW w:type="dxa" w:w="1872"/>
+            <w:tcW w:type="dxa" w:w="2340"/>
           </w:tcPr>
           <w:p>
             <w:pPr>
@@ -2417,30 +2491,7 @@
                 <w:rFonts w:ascii="Microsoft YaHei" w:hAnsi="Microsoft YaHei"/>
                 <w:sz w:val="19"/>
               </w:rPr>
-              <w:t>0.0059</w:t>
-            </w:r>
-          </w:p>
-        </w:tc>
-        <w:tc>
-          <w:tcPr>
-            <w:tcW w:type="dxa" w:w="1872"/>
-          </w:tcPr>
-          <w:p>
-            <w:pPr>
-              <w:jc w:val="center"/>
-            </w:pPr>
-            <w:r>
-              <w:rPr>
-                <w:rFonts w:ascii="Microsoft YaHei" w:hAnsi="Microsoft YaHei"/>
-                <w:sz w:val="19"/>
-              </w:rPr>
-            </w:r>
-            <w:r>
-              <w:rPr>
-                <w:rFonts w:ascii="Microsoft YaHei" w:hAnsi="Microsoft YaHei"/>
-                <w:sz w:val="19"/>
-              </w:rPr>
-              <w:t>&lt; 1s</w:t>
+              <w:t>0.0040</w:t>
             </w:r>
           </w:p>
         </w:tc>
@@ -2448,7 +2499,7 @@
       <w:tr>
         <w:tc>
           <w:tcPr>
-            <w:tcW w:type="dxa" w:w="1872"/>
+            <w:tcW w:type="dxa" w:w="2340"/>
           </w:tcPr>
           <w:p>
             <w:pPr>
@@ -2463,15 +2514,23 @@
             <w:r>
               <w:rPr>
                 <w:rFonts w:ascii="Microsoft YaHei" w:hAnsi="Microsoft YaHei"/>
-                <w:sz w:val="19"/>
-              </w:rPr>
-              <w:t>ItemCF</w:t>
+                <w:b/>
+                <w:sz w:val="19"/>
+              </w:rPr>
+              <w:t>BPR</w:t>
+            </w:r>
+            <w:r>
+              <w:rPr>
+                <w:rFonts w:ascii="Microsoft YaHei" w:hAnsi="Microsoft YaHei"/>
+                <w:sz w:val="19"/>
+              </w:rPr>
+              <w:t xml:space="preserve"> 🏆</w:t>
             </w:r>
           </w:p>
         </w:tc>
         <w:tc>
           <w:tcPr>
-            <w:tcW w:type="dxa" w:w="1872"/>
+            <w:tcW w:type="dxa" w:w="2340"/>
           </w:tcPr>
           <w:p>
             <w:pPr>
@@ -2486,15 +2545,16 @@
             <w:r>
               <w:rPr>
                 <w:rFonts w:ascii="Microsoft YaHei" w:hAnsi="Microsoft YaHei"/>
-                <w:sz w:val="19"/>
-              </w:rPr>
-              <w:t>0.0050</w:t>
+                <w:b/>
+                <w:sz w:val="19"/>
+              </w:rPr>
+              <w:t>0.0209</w:t>
             </w:r>
           </w:p>
         </w:tc>
         <w:tc>
           <w:tcPr>
-            <w:tcW w:type="dxa" w:w="1872"/>
+            <w:tcW w:type="dxa" w:w="2340"/>
           </w:tcPr>
           <w:p>
             <w:pPr>
@@ -2509,15 +2569,16 @@
             <w:r>
               <w:rPr>
                 <w:rFonts w:ascii="Microsoft YaHei" w:hAnsi="Microsoft YaHei"/>
-                <w:sz w:val="19"/>
-              </w:rPr>
-              <w:t>0.0082</w:t>
+                <w:b/>
+                <w:sz w:val="19"/>
+              </w:rPr>
+              <w:t>0.0375</w:t>
             </w:r>
           </w:p>
         </w:tc>
         <w:tc>
           <w:tcPr>
-            <w:tcW w:type="dxa" w:w="1872"/>
+            <w:tcW w:type="dxa" w:w="2340"/>
           </w:tcPr>
           <w:p>
             <w:pPr>
@@ -2532,32 +2593,10 @@
             <w:r>
               <w:rPr>
                 <w:rFonts w:ascii="Microsoft YaHei" w:hAnsi="Microsoft YaHei"/>
-                <w:sz w:val="19"/>
-              </w:rPr>
-              <w:t>0.0040</w:t>
-            </w:r>
-          </w:p>
-        </w:tc>
-        <w:tc>
-          <w:tcPr>
-            <w:tcW w:type="dxa" w:w="1872"/>
-          </w:tcPr>
-          <w:p>
-            <w:pPr>
-              <w:jc w:val="center"/>
-            </w:pPr>
-            <w:r>
-              <w:rPr>
-                <w:rFonts w:ascii="Microsoft YaHei" w:hAnsi="Microsoft YaHei"/>
-                <w:sz w:val="19"/>
-              </w:rPr>
-            </w:r>
-            <w:r>
-              <w:rPr>
-                <w:rFonts w:ascii="Microsoft YaHei" w:hAnsi="Microsoft YaHei"/>
-                <w:sz w:val="19"/>
-              </w:rPr>
-              <w:t>41.9s</w:t>
+                <w:b/>
+                <w:sz w:val="19"/>
+              </w:rPr>
+              <w:t>0.0159</w:t>
             </w:r>
           </w:p>
         </w:tc>
@@ -2565,7 +2604,7 @@
       <w:tr>
         <w:tc>
           <w:tcPr>
-            <w:tcW w:type="dxa" w:w="1872"/>
+            <w:tcW w:type="dxa" w:w="2340"/>
           </w:tcPr>
           <w:p>
             <w:pPr>
@@ -2580,23 +2619,15 @@
             <w:r>
               <w:rPr>
                 <w:rFonts w:ascii="Microsoft YaHei" w:hAnsi="Microsoft YaHei"/>
-                <w:b/>
-                <w:sz w:val="19"/>
-              </w:rPr>
-              <w:t>BPR_Ultra</w:t>
-            </w:r>
-            <w:r>
-              <w:rPr>
-                <w:rFonts w:ascii="Microsoft YaHei" w:hAnsi="Microsoft YaHei"/>
-                <w:sz w:val="19"/>
-              </w:rPr>
-              <w:t xml:space="preserve"> 🏆</w:t>
+                <w:sz w:val="19"/>
+              </w:rPr>
+              <w:t>SASRec</w:t>
             </w:r>
           </w:p>
         </w:tc>
         <w:tc>
           <w:tcPr>
-            <w:tcW w:type="dxa" w:w="1872"/>
+            <w:tcW w:type="dxa" w:w="2340"/>
           </w:tcPr>
           <w:p>
             <w:pPr>
@@ -2611,16 +2642,15 @@
             <w:r>
               <w:rPr>
                 <w:rFonts w:ascii="Microsoft YaHei" w:hAnsi="Microsoft YaHei"/>
-                <w:b/>
-                <w:sz w:val="19"/>
-              </w:rPr>
-              <w:t>0.0209</w:t>
+                <w:sz w:val="19"/>
+              </w:rPr>
+              <w:t>0.0086</w:t>
             </w:r>
           </w:p>
         </w:tc>
         <w:tc>
           <w:tcPr>
-            <w:tcW w:type="dxa" w:w="1872"/>
+            <w:tcW w:type="dxa" w:w="2340"/>
           </w:tcPr>
           <w:p>
             <w:pPr>
@@ -2635,16 +2665,15 @@
             <w:r>
               <w:rPr>
                 <w:rFonts w:ascii="Microsoft YaHei" w:hAnsi="Microsoft YaHei"/>
-                <w:b/>
-                <w:sz w:val="19"/>
-              </w:rPr>
-              <w:t>0.0375</w:t>
+                <w:sz w:val="19"/>
+              </w:rPr>
+              <w:t>0.0165</w:t>
             </w:r>
           </w:p>
         </w:tc>
         <w:tc>
           <w:tcPr>
-            <w:tcW w:type="dxa" w:w="1872"/>
+            <w:tcW w:type="dxa" w:w="2340"/>
           </w:tcPr>
           <w:p>
             <w:pPr>
@@ -2659,33 +2688,9 @@
             <w:r>
               <w:rPr>
                 <w:rFonts w:ascii="Microsoft YaHei" w:hAnsi="Microsoft YaHei"/>
-                <w:b/>
-                <w:sz w:val="19"/>
-              </w:rPr>
-              <w:t>0.0159</w:t>
-            </w:r>
-          </w:p>
-        </w:tc>
-        <w:tc>
-          <w:tcPr>
-            <w:tcW w:type="dxa" w:w="1872"/>
-          </w:tcPr>
-          <w:p>
-            <w:pPr>
-              <w:jc w:val="center"/>
-            </w:pPr>
-            <w:r>
-              <w:rPr>
-                <w:rFonts w:ascii="Microsoft YaHei" w:hAnsi="Microsoft YaHei"/>
-                <w:sz w:val="19"/>
-              </w:rPr>
-            </w:r>
-            <w:r>
-              <w:rPr>
-                <w:rFonts w:ascii="Microsoft YaHei" w:hAnsi="Microsoft YaHei"/>
-                <w:sz w:val="19"/>
-              </w:rPr>
-              <w:t>18.8s (V100 向量化)</w:t>
+                <w:sz w:val="19"/>
+              </w:rPr>
+              <w:t>0.0063</w:t>
             </w:r>
           </w:p>
         </w:tc>
@@ -2693,7 +2698,7 @@
       <w:tr>
         <w:tc>
           <w:tcPr>
-            <w:tcW w:type="dxa" w:w="1872"/>
+            <w:tcW w:type="dxa" w:w="2340"/>
           </w:tcPr>
           <w:p>
             <w:pPr>
@@ -2710,13 +2715,13 @@
                 <w:rFonts w:ascii="Microsoft YaHei" w:hAnsi="Microsoft YaHei"/>
                 <w:sz w:val="19"/>
               </w:rPr>
-              <w:t>SASRec</w:t>
+              <w:t>LLM Zero-Shot</w:t>
             </w:r>
           </w:p>
         </w:tc>
         <w:tc>
           <w:tcPr>
-            <w:tcW w:type="dxa" w:w="1872"/>
+            <w:tcW w:type="dxa" w:w="2340"/>
           </w:tcPr>
           <w:p>
             <w:pPr>
@@ -2733,13 +2738,13 @@
                 <w:rFonts w:ascii="Microsoft YaHei" w:hAnsi="Microsoft YaHei"/>
                 <w:sz w:val="19"/>
               </w:rPr>
-              <w:t>0.0086</w:t>
+              <w:t>0.0154</w:t>
             </w:r>
           </w:p>
         </w:tc>
         <w:tc>
           <w:tcPr>
-            <w:tcW w:type="dxa" w:w="1872"/>
+            <w:tcW w:type="dxa" w:w="2340"/>
           </w:tcPr>
           <w:p>
             <w:pPr>
@@ -2756,13 +2761,13 @@
                 <w:rFonts w:ascii="Microsoft YaHei" w:hAnsi="Microsoft YaHei"/>
                 <w:sz w:val="19"/>
               </w:rPr>
-              <w:t>0.0165</w:t>
+              <w:t>0.0260</w:t>
             </w:r>
           </w:p>
         </w:tc>
         <w:tc>
           <w:tcPr>
-            <w:tcW w:type="dxa" w:w="1872"/>
+            <w:tcW w:type="dxa" w:w="2340"/>
           </w:tcPr>
           <w:p>
             <w:pPr>
@@ -2779,30 +2784,7 @@
                 <w:rFonts w:ascii="Microsoft YaHei" w:hAnsi="Microsoft YaHei"/>
                 <w:sz w:val="19"/>
               </w:rPr>
-              <w:t>0.0063</w:t>
-            </w:r>
-          </w:p>
-        </w:tc>
-        <w:tc>
-          <w:tcPr>
-            <w:tcW w:type="dxa" w:w="1872"/>
-          </w:tcPr>
-          <w:p>
-            <w:pPr>
-              <w:jc w:val="center"/>
-            </w:pPr>
-            <w:r>
-              <w:rPr>
-                <w:rFonts w:ascii="Microsoft YaHei" w:hAnsi="Microsoft YaHei"/>
-                <w:sz w:val="19"/>
-              </w:rPr>
-            </w:r>
-            <w:r>
-              <w:rPr>
-                <w:rFonts w:ascii="Microsoft YaHei" w:hAnsi="Microsoft YaHei"/>
-                <w:sz w:val="19"/>
-              </w:rPr>
-              <w:t>14.8s (向量化加速后)</w:t>
+              <w:t>0.0122</w:t>
             </w:r>
           </w:p>
         </w:tc>
@@ -2810,7 +2792,7 @@
       <w:tr>
         <w:tc>
           <w:tcPr>
-            <w:tcW w:type="dxa" w:w="1872"/>
+            <w:tcW w:type="dxa" w:w="2340"/>
           </w:tcPr>
           <w:p>
             <w:pPr>
@@ -2827,13 +2809,13 @@
                 <w:rFonts w:ascii="Microsoft YaHei" w:hAnsi="Microsoft YaHei"/>
                 <w:sz w:val="19"/>
               </w:rPr>
-              <w:t>LLM Zero-Shot</w:t>
+              <w:t>LLM Few-Shot</w:t>
             </w:r>
           </w:p>
         </w:tc>
         <w:tc>
           <w:tcPr>
-            <w:tcW w:type="dxa" w:w="1872"/>
+            <w:tcW w:type="dxa" w:w="2340"/>
           </w:tcPr>
           <w:p>
             <w:pPr>
@@ -2850,13 +2832,13 @@
                 <w:rFonts w:ascii="Microsoft YaHei" w:hAnsi="Microsoft YaHei"/>
                 <w:sz w:val="19"/>
               </w:rPr>
-              <w:t>0.0154</w:t>
+              <w:t>0.0187</w:t>
             </w:r>
           </w:p>
         </w:tc>
         <w:tc>
           <w:tcPr>
-            <w:tcW w:type="dxa" w:w="1872"/>
+            <w:tcW w:type="dxa" w:w="2340"/>
           </w:tcPr>
           <w:p>
             <w:pPr>
@@ -2873,13 +2855,13 @@
                 <w:rFonts w:ascii="Microsoft YaHei" w:hAnsi="Microsoft YaHei"/>
                 <w:sz w:val="19"/>
               </w:rPr>
-              <w:t>0.0260</w:t>
+              <w:t>0.0300</w:t>
             </w:r>
           </w:p>
         </w:tc>
         <w:tc>
           <w:tcPr>
-            <w:tcW w:type="dxa" w:w="1872"/>
+            <w:tcW w:type="dxa" w:w="2340"/>
           </w:tcPr>
           <w:p>
             <w:pPr>
@@ -2896,147 +2878,7 @@
                 <w:rFonts w:ascii="Microsoft YaHei" w:hAnsi="Microsoft YaHei"/>
                 <w:sz w:val="19"/>
               </w:rPr>
-              <w:t>0.0122</w:t>
-            </w:r>
-          </w:p>
-        </w:tc>
-        <w:tc>
-          <w:tcPr>
-            <w:tcW w:type="dxa" w:w="1872"/>
-          </w:tcPr>
-          <w:p>
-            <w:pPr>
-              <w:jc w:val="center"/>
-            </w:pPr>
-            <w:r>
-              <w:rPr>
-                <w:rFonts w:ascii="Microsoft YaHei" w:hAnsi="Microsoft YaHei"/>
-                <w:sz w:val="19"/>
-              </w:rPr>
-            </w:r>
-            <w:r>
-              <w:rPr>
-                <w:rFonts w:ascii="Microsoft YaHei" w:hAnsi="Microsoft YaHei"/>
-                <w:sz w:val="19"/>
-              </w:rPr>
-              <w:t>API 耗时约 556s</w:t>
-            </w:r>
-          </w:p>
-        </w:tc>
-      </w:tr>
-      <w:tr>
-        <w:tc>
-          <w:tcPr>
-            <w:tcW w:type="dxa" w:w="1872"/>
-          </w:tcPr>
-          <w:p>
-            <w:pPr>
-              <w:jc w:val="left"/>
-            </w:pPr>
-            <w:r>
-              <w:rPr>
-                <w:rFonts w:ascii="Microsoft YaHei" w:hAnsi="Microsoft YaHei"/>
-                <w:sz w:val="19"/>
-              </w:rPr>
-            </w:r>
-            <w:r>
-              <w:rPr>
-                <w:rFonts w:ascii="Microsoft YaHei" w:hAnsi="Microsoft YaHei"/>
-                <w:sz w:val="19"/>
-              </w:rPr>
-              <w:t>LLM Few-Shot</w:t>
-            </w:r>
-          </w:p>
-        </w:tc>
-        <w:tc>
-          <w:tcPr>
-            <w:tcW w:type="dxa" w:w="1872"/>
-          </w:tcPr>
-          <w:p>
-            <w:pPr>
-              <w:jc w:val="center"/>
-            </w:pPr>
-            <w:r>
-              <w:rPr>
-                <w:rFonts w:ascii="Microsoft YaHei" w:hAnsi="Microsoft YaHei"/>
-                <w:sz w:val="19"/>
-              </w:rPr>
-            </w:r>
-            <w:r>
-              <w:rPr>
-                <w:rFonts w:ascii="Microsoft YaHei" w:hAnsi="Microsoft YaHei"/>
-                <w:sz w:val="19"/>
-              </w:rPr>
-              <w:t>0.0187</w:t>
-            </w:r>
-          </w:p>
-        </w:tc>
-        <w:tc>
-          <w:tcPr>
-            <w:tcW w:type="dxa" w:w="1872"/>
-          </w:tcPr>
-          <w:p>
-            <w:pPr>
-              <w:jc w:val="center"/>
-            </w:pPr>
-            <w:r>
-              <w:rPr>
-                <w:rFonts w:ascii="Microsoft YaHei" w:hAnsi="Microsoft YaHei"/>
-                <w:sz w:val="19"/>
-              </w:rPr>
-            </w:r>
-            <w:r>
-              <w:rPr>
-                <w:rFonts w:ascii="Microsoft YaHei" w:hAnsi="Microsoft YaHei"/>
-                <w:sz w:val="19"/>
-              </w:rPr>
-              <w:t>0.0300</w:t>
-            </w:r>
-          </w:p>
-        </w:tc>
-        <w:tc>
-          <w:tcPr>
-            <w:tcW w:type="dxa" w:w="1872"/>
-          </w:tcPr>
-          <w:p>
-            <w:pPr>
-              <w:jc w:val="center"/>
-            </w:pPr>
-            <w:r>
-              <w:rPr>
-                <w:rFonts w:ascii="Microsoft YaHei" w:hAnsi="Microsoft YaHei"/>
-                <w:sz w:val="19"/>
-              </w:rPr>
-            </w:r>
-            <w:r>
-              <w:rPr>
-                <w:rFonts w:ascii="Microsoft YaHei" w:hAnsi="Microsoft YaHei"/>
-                <w:sz w:val="19"/>
-              </w:rPr>
               <w:t>0.0152</w:t>
-            </w:r>
-          </w:p>
-        </w:tc>
-        <w:tc>
-          <w:tcPr>
-            <w:tcW w:type="dxa" w:w="1872"/>
-          </w:tcPr>
-          <w:p>
-            <w:pPr>
-              <w:jc w:val="center"/>
-            </w:pPr>
-            <w:r>
-              <w:rPr>
-                <w:rFonts w:ascii="Microsoft YaHei" w:hAnsi="Microsoft YaHei"/>
-                <w:sz w:val="19"/>
-              </w:rPr>
-            </w:r>
-            <w:r>
-              <w:rPr>
-                <w:rFonts w:ascii="Microsoft YaHei" w:hAnsi="Microsoft YaHei"/>
-                <w:sz w:val="19"/>
-              </w:rPr>
-              <w:t>API 耗时约 568s</w:t>
             </w:r>
           </w:p>
         </w:tc>
@@ -3070,16 +2912,15 @@
         <w:tblLook w:firstColumn="1" w:firstRow="1" w:lastColumn="0" w:lastRow="0" w:noHBand="0" w:noVBand="1" w:val="04A0"/>
       </w:tblPr>
       <w:tblGrid>
-        <w:gridCol w:w="1872"/>
-        <w:gridCol w:w="1872"/>
-        <w:gridCol w:w="1872"/>
-        <w:gridCol w:w="1872"/>
-        <w:gridCol w:w="1872"/>
+        <w:gridCol w:w="2340"/>
+        <w:gridCol w:w="2340"/>
+        <w:gridCol w:w="2340"/>
+        <w:gridCol w:w="2340"/>
       </w:tblGrid>
       <w:tr>
         <w:tc>
           <w:tcPr>
-            <w:tcW w:type="dxa" w:w="1872"/>
+            <w:tcW w:type="dxa" w:w="2340"/>
           </w:tcPr>
           <w:p>
             <w:pPr>
@@ -3098,7 +2939,7 @@
         </w:tc>
         <w:tc>
           <w:tcPr>
-            <w:tcW w:type="dxa" w:w="1872"/>
+            <w:tcW w:type="dxa" w:w="2340"/>
           </w:tcPr>
           <w:p>
             <w:pPr>
@@ -3117,7 +2958,7 @@
         </w:tc>
         <w:tc>
           <w:tcPr>
-            <w:tcW w:type="dxa" w:w="1872"/>
+            <w:tcW w:type="dxa" w:w="2340"/>
           </w:tcPr>
           <w:p>
             <w:pPr>
@@ -3136,7 +2977,7 @@
         </w:tc>
         <w:tc>
           <w:tcPr>
-            <w:tcW w:type="dxa" w:w="1872"/>
+            <w:tcW w:type="dxa" w:w="2340"/>
           </w:tcPr>
           <w:p>
             <w:pPr>
@@ -3153,22 +2994,97 @@
             </w:r>
           </w:p>
         </w:tc>
+      </w:tr>
+      <w:tr>
         <w:tc>
           <w:tcPr>
-            <w:tcW w:type="dxa" w:w="1872"/>
+            <w:tcW w:type="dxa" w:w="2340"/>
+          </w:tcPr>
+          <w:p>
+            <w:pPr>
+              <w:jc w:val="left"/>
+            </w:pPr>
+            <w:r>
+              <w:rPr>
+                <w:rFonts w:ascii="Microsoft YaHei" w:hAnsi="Microsoft YaHei"/>
+                <w:sz w:val="19"/>
+              </w:rPr>
+            </w:r>
+            <w:r>
+              <w:rPr>
+                <w:rFonts w:ascii="Microsoft YaHei" w:hAnsi="Microsoft YaHei"/>
+                <w:sz w:val="19"/>
+              </w:rPr>
+              <w:t>Popularity</w:t>
+            </w:r>
+          </w:p>
+        </w:tc>
+        <w:tc>
+          <w:tcPr>
+            <w:tcW w:type="dxa" w:w="2340"/>
           </w:tcPr>
           <w:p>
             <w:pPr>
               <w:jc w:val="center"/>
             </w:pPr>
-            <w:r/>
-            <w:r>
-              <w:rPr>
-                <w:rFonts w:ascii="Microsoft YaHei" w:hAnsi="Microsoft YaHei"/>
-                <w:b/>
-                <w:sz w:val="20"/>
-              </w:rPr>
-              <w:t>运行开销 / 推理耗时</w:t>
+            <w:r>
+              <w:rPr>
+                <w:rFonts w:ascii="Microsoft YaHei" w:hAnsi="Microsoft YaHei"/>
+                <w:sz w:val="19"/>
+              </w:rPr>
+            </w:r>
+            <w:r>
+              <w:rPr>
+                <w:rFonts w:ascii="Microsoft YaHei" w:hAnsi="Microsoft YaHei"/>
+                <w:sz w:val="19"/>
+              </w:rPr>
+              <w:t>0.0128</w:t>
+            </w:r>
+          </w:p>
+        </w:tc>
+        <w:tc>
+          <w:tcPr>
+            <w:tcW w:type="dxa" w:w="2340"/>
+          </w:tcPr>
+          <w:p>
+            <w:pPr>
+              <w:jc w:val="center"/>
+            </w:pPr>
+            <w:r>
+              <w:rPr>
+                <w:rFonts w:ascii="Microsoft YaHei" w:hAnsi="Microsoft YaHei"/>
+                <w:sz w:val="19"/>
+              </w:rPr>
+            </w:r>
+            <w:r>
+              <w:rPr>
+                <w:rFonts w:ascii="Microsoft YaHei" w:hAnsi="Microsoft YaHei"/>
+                <w:sz w:val="19"/>
+              </w:rPr>
+              <w:t>0.0243</w:t>
+            </w:r>
+          </w:p>
+        </w:tc>
+        <w:tc>
+          <w:tcPr>
+            <w:tcW w:type="dxa" w:w="2340"/>
+          </w:tcPr>
+          <w:p>
+            <w:pPr>
+              <w:jc w:val="center"/>
+            </w:pPr>
+            <w:r>
+              <w:rPr>
+                <w:rFonts w:ascii="Microsoft YaHei" w:hAnsi="Microsoft YaHei"/>
+                <w:sz w:val="19"/>
+              </w:rPr>
+            </w:r>
+            <w:r>
+              <w:rPr>
+                <w:rFonts w:ascii="Microsoft YaHei" w:hAnsi="Microsoft YaHei"/>
+                <w:sz w:val="19"/>
+              </w:rPr>
+              <w:t>0.0094</w:t>
             </w:r>
           </w:p>
         </w:tc>
@@ -3176,7 +3092,7 @@
       <w:tr>
         <w:tc>
           <w:tcPr>
-            <w:tcW w:type="dxa" w:w="1872"/>
+            <w:tcW w:type="dxa" w:w="2340"/>
           </w:tcPr>
           <w:p>
             <w:pPr>
@@ -3193,13 +3109,13 @@
                 <w:rFonts w:ascii="Microsoft YaHei" w:hAnsi="Microsoft YaHei"/>
                 <w:sz w:val="19"/>
               </w:rPr>
-              <w:t>Popularity</w:t>
+              <w:t>ItemCF</w:t>
             </w:r>
           </w:p>
         </w:tc>
         <w:tc>
           <w:tcPr>
-            <w:tcW w:type="dxa" w:w="1872"/>
+            <w:tcW w:type="dxa" w:w="2340"/>
           </w:tcPr>
           <w:p>
             <w:pPr>
@@ -3216,13 +3132,13 @@
                 <w:rFonts w:ascii="Microsoft YaHei" w:hAnsi="Microsoft YaHei"/>
                 <w:sz w:val="19"/>
               </w:rPr>
-              <w:t>0.0128</w:t>
+              <w:t>0.0023</w:t>
             </w:r>
           </w:p>
         </w:tc>
         <w:tc>
           <w:tcPr>
-            <w:tcW w:type="dxa" w:w="1872"/>
+            <w:tcW w:type="dxa" w:w="2340"/>
           </w:tcPr>
           <w:p>
             <w:pPr>
@@ -3239,13 +3155,13 @@
                 <w:rFonts w:ascii="Microsoft YaHei" w:hAnsi="Microsoft YaHei"/>
                 <w:sz w:val="19"/>
               </w:rPr>
-              <w:t>0.0243</w:t>
+              <w:t>0.0044</w:t>
             </w:r>
           </w:p>
         </w:tc>
         <w:tc>
           <w:tcPr>
-            <w:tcW w:type="dxa" w:w="1872"/>
+            <w:tcW w:type="dxa" w:w="2340"/>
           </w:tcPr>
           <w:p>
             <w:pPr>
@@ -3262,30 +3178,7 @@
                 <w:rFonts w:ascii="Microsoft YaHei" w:hAnsi="Microsoft YaHei"/>
                 <w:sz w:val="19"/>
               </w:rPr>
-              <w:t>0.0094</w:t>
-            </w:r>
-          </w:p>
-        </w:tc>
-        <w:tc>
-          <w:tcPr>
-            <w:tcW w:type="dxa" w:w="1872"/>
-          </w:tcPr>
-          <w:p>
-            <w:pPr>
-              <w:jc w:val="center"/>
-            </w:pPr>
-            <w:r>
-              <w:rPr>
-                <w:rFonts w:ascii="Microsoft YaHei" w:hAnsi="Microsoft YaHei"/>
-                <w:sz w:val="19"/>
-              </w:rPr>
-            </w:r>
-            <w:r>
-              <w:rPr>
-                <w:rFonts w:ascii="Microsoft YaHei" w:hAnsi="Microsoft YaHei"/>
-                <w:sz w:val="19"/>
-              </w:rPr>
-              <w:t>&lt; 1s</w:t>
+              <w:t>0.0017</w:t>
             </w:r>
           </w:p>
         </w:tc>
@@ -3293,7 +3186,7 @@
       <w:tr>
         <w:tc>
           <w:tcPr>
-            <w:tcW w:type="dxa" w:w="1872"/>
+            <w:tcW w:type="dxa" w:w="2340"/>
           </w:tcPr>
           <w:p>
             <w:pPr>
@@ -3308,15 +3201,23 @@
             <w:r>
               <w:rPr>
                 <w:rFonts w:ascii="Microsoft YaHei" w:hAnsi="Microsoft YaHei"/>
-                <w:sz w:val="19"/>
-              </w:rPr>
-              <w:t>ItemCF</w:t>
+                <w:b/>
+                <w:sz w:val="19"/>
+              </w:rPr>
+              <w:t>BPR</w:t>
+            </w:r>
+            <w:r>
+              <w:rPr>
+                <w:rFonts w:ascii="Microsoft YaHei" w:hAnsi="Microsoft YaHei"/>
+                <w:sz w:val="19"/>
+              </w:rPr>
+              <w:t xml:space="preserve"> 🏆</w:t>
             </w:r>
           </w:p>
         </w:tc>
         <w:tc>
           <w:tcPr>
-            <w:tcW w:type="dxa" w:w="1872"/>
+            <w:tcW w:type="dxa" w:w="2340"/>
           </w:tcPr>
           <w:p>
             <w:pPr>
@@ -3331,15 +3232,16 @@
             <w:r>
               <w:rPr>
                 <w:rFonts w:ascii="Microsoft YaHei" w:hAnsi="Microsoft YaHei"/>
-                <w:sz w:val="19"/>
-              </w:rPr>
-              <w:t>0.0023</w:t>
+                <w:b/>
+                <w:sz w:val="19"/>
+              </w:rPr>
+              <w:t>0.0304</w:t>
             </w:r>
           </w:p>
         </w:tc>
         <w:tc>
           <w:tcPr>
-            <w:tcW w:type="dxa" w:w="1872"/>
+            <w:tcW w:type="dxa" w:w="2340"/>
           </w:tcPr>
           <w:p>
             <w:pPr>
@@ -3354,15 +3256,16 @@
             <w:r>
               <w:rPr>
                 <w:rFonts w:ascii="Microsoft YaHei" w:hAnsi="Microsoft YaHei"/>
-                <w:sz w:val="19"/>
-              </w:rPr>
-              <w:t>0.0044</w:t>
+                <w:b/>
+                <w:sz w:val="19"/>
+              </w:rPr>
+              <w:t>0.0561</w:t>
             </w:r>
           </w:p>
         </w:tc>
         <w:tc>
           <w:tcPr>
-            <w:tcW w:type="dxa" w:w="1872"/>
+            <w:tcW w:type="dxa" w:w="2340"/>
           </w:tcPr>
           <w:p>
             <w:pPr>
@@ -3377,32 +3280,10 @@
             <w:r>
               <w:rPr>
                 <w:rFonts w:ascii="Microsoft YaHei" w:hAnsi="Microsoft YaHei"/>
-                <w:sz w:val="19"/>
-              </w:rPr>
-              <w:t>0.0017</w:t>
-            </w:r>
-          </w:p>
-        </w:tc>
-        <w:tc>
-          <w:tcPr>
-            <w:tcW w:type="dxa" w:w="1872"/>
-          </w:tcPr>
-          <w:p>
-            <w:pPr>
-              <w:jc w:val="center"/>
-            </w:pPr>
-            <w:r>
-              <w:rPr>
-                <w:rFonts w:ascii="Microsoft YaHei" w:hAnsi="Microsoft YaHei"/>
-                <w:sz w:val="19"/>
-              </w:rPr>
-            </w:r>
-            <w:r>
-              <w:rPr>
-                <w:rFonts w:ascii="Microsoft YaHei" w:hAnsi="Microsoft YaHei"/>
-                <w:sz w:val="19"/>
-              </w:rPr>
-              <w:t>30.5s</w:t>
+                <w:b/>
+                <w:sz w:val="19"/>
+              </w:rPr>
+              <w:t>0.0226</w:t>
             </w:r>
           </w:p>
         </w:tc>
@@ -3410,7 +3291,7 @@
       <w:tr>
         <w:tc>
           <w:tcPr>
-            <w:tcW w:type="dxa" w:w="1872"/>
+            <w:tcW w:type="dxa" w:w="2340"/>
           </w:tcPr>
           <w:p>
             <w:pPr>
@@ -3425,23 +3306,15 @@
             <w:r>
               <w:rPr>
                 <w:rFonts w:ascii="Microsoft YaHei" w:hAnsi="Microsoft YaHei"/>
-                <w:b/>
-                <w:sz w:val="19"/>
-              </w:rPr>
-              <w:t>BPR_Ultra</w:t>
-            </w:r>
-            <w:r>
-              <w:rPr>
-                <w:rFonts w:ascii="Microsoft YaHei" w:hAnsi="Microsoft YaHei"/>
-                <w:sz w:val="19"/>
-              </w:rPr>
-              <w:t xml:space="preserve"> 🏆</w:t>
+                <w:sz w:val="19"/>
+              </w:rPr>
+              <w:t>SASRec</w:t>
             </w:r>
           </w:p>
         </w:tc>
         <w:tc>
           <w:tcPr>
-            <w:tcW w:type="dxa" w:w="1872"/>
+            <w:tcW w:type="dxa" w:w="2340"/>
           </w:tcPr>
           <w:p>
             <w:pPr>
@@ -3456,16 +3329,15 @@
             <w:r>
               <w:rPr>
                 <w:rFonts w:ascii="Microsoft YaHei" w:hAnsi="Microsoft YaHei"/>
-                <w:b/>
-                <w:sz w:val="19"/>
-              </w:rPr>
-              <w:t>0.0304</w:t>
+                <w:sz w:val="19"/>
+              </w:rPr>
+              <w:t>0.0095</w:t>
             </w:r>
           </w:p>
         </w:tc>
         <w:tc>
           <w:tcPr>
-            <w:tcW w:type="dxa" w:w="1872"/>
+            <w:tcW w:type="dxa" w:w="2340"/>
           </w:tcPr>
           <w:p>
             <w:pPr>
@@ -3480,16 +3352,15 @@
             <w:r>
               <w:rPr>
                 <w:rFonts w:ascii="Microsoft YaHei" w:hAnsi="Microsoft YaHei"/>
-                <w:b/>
-                <w:sz w:val="19"/>
-              </w:rPr>
-              <w:t>0.0561</w:t>
+                <w:sz w:val="19"/>
+              </w:rPr>
+              <w:t>0.0193</w:t>
             </w:r>
           </w:p>
         </w:tc>
         <w:tc>
           <w:tcPr>
-            <w:tcW w:type="dxa" w:w="1872"/>
+            <w:tcW w:type="dxa" w:w="2340"/>
           </w:tcPr>
           <w:p>
             <w:pPr>
@@ -3504,33 +3375,9 @@
             <w:r>
               <w:rPr>
                 <w:rFonts w:ascii="Microsoft YaHei" w:hAnsi="Microsoft YaHei"/>
-                <w:b/>
-                <w:sz w:val="19"/>
-              </w:rPr>
-              <w:t>0.0226</w:t>
-            </w:r>
-          </w:p>
-        </w:tc>
-        <w:tc>
-          <w:tcPr>
-            <w:tcW w:type="dxa" w:w="1872"/>
-          </w:tcPr>
-          <w:p>
-            <w:pPr>
-              <w:jc w:val="center"/>
-            </w:pPr>
-            <w:r>
-              <w:rPr>
-                <w:rFonts w:ascii="Microsoft YaHei" w:hAnsi="Microsoft YaHei"/>
-                <w:sz w:val="19"/>
-              </w:rPr>
-            </w:r>
-            <w:r>
-              <w:rPr>
-                <w:rFonts w:ascii="Microsoft YaHei" w:hAnsi="Microsoft YaHei"/>
-                <w:sz w:val="19"/>
-              </w:rPr>
-              <w:t>22.1s (V100 向量化)</w:t>
+                <w:sz w:val="19"/>
+              </w:rPr>
+              <w:t>0.0066</w:t>
             </w:r>
           </w:p>
         </w:tc>
@@ -3538,7 +3385,7 @@
       <w:tr>
         <w:tc>
           <w:tcPr>
-            <w:tcW w:type="dxa" w:w="1872"/>
+            <w:tcW w:type="dxa" w:w="2340"/>
           </w:tcPr>
           <w:p>
             <w:pPr>
@@ -3555,13 +3402,13 @@
                 <w:rFonts w:ascii="Microsoft YaHei" w:hAnsi="Microsoft YaHei"/>
                 <w:sz w:val="19"/>
               </w:rPr>
-              <w:t>SASRec</w:t>
+              <w:t>LLM Zero-Shot</w:t>
             </w:r>
           </w:p>
         </w:tc>
         <w:tc>
           <w:tcPr>
-            <w:tcW w:type="dxa" w:w="1872"/>
+            <w:tcW w:type="dxa" w:w="2340"/>
           </w:tcPr>
           <w:p>
             <w:pPr>
@@ -3578,13 +3425,13 @@
                 <w:rFonts w:ascii="Microsoft YaHei" w:hAnsi="Microsoft YaHei"/>
                 <w:sz w:val="19"/>
               </w:rPr>
-              <w:t>0.0095</w:t>
+              <w:t>0.0083</w:t>
             </w:r>
           </w:p>
         </w:tc>
         <w:tc>
           <w:tcPr>
-            <w:tcW w:type="dxa" w:w="1872"/>
+            <w:tcW w:type="dxa" w:w="2340"/>
           </w:tcPr>
           <w:p>
             <w:pPr>
@@ -3601,13 +3448,13 @@
                 <w:rFonts w:ascii="Microsoft YaHei" w:hAnsi="Microsoft YaHei"/>
                 <w:sz w:val="19"/>
               </w:rPr>
-              <w:t>0.0193</w:t>
+              <w:t>0.0180</w:t>
             </w:r>
           </w:p>
         </w:tc>
         <w:tc>
           <w:tcPr>
-            <w:tcW w:type="dxa" w:w="1872"/>
+            <w:tcW w:type="dxa" w:w="2340"/>
           </w:tcPr>
           <w:p>
             <w:pPr>
@@ -3624,30 +3471,7 @@
                 <w:rFonts w:ascii="Microsoft YaHei" w:hAnsi="Microsoft YaHei"/>
                 <w:sz w:val="19"/>
               </w:rPr>
-              <w:t>0.0066</w:t>
-            </w:r>
-          </w:p>
-        </w:tc>
-        <w:tc>
-          <w:tcPr>
-            <w:tcW w:type="dxa" w:w="1872"/>
-          </w:tcPr>
-          <w:p>
-            <w:pPr>
-              <w:jc w:val="center"/>
-            </w:pPr>
-            <w:r>
-              <w:rPr>
-                <w:rFonts w:ascii="Microsoft YaHei" w:hAnsi="Microsoft YaHei"/>
-                <w:sz w:val="19"/>
-              </w:rPr>
-            </w:r>
-            <w:r>
-              <w:rPr>
-                <w:rFonts w:ascii="Microsoft YaHei" w:hAnsi="Microsoft YaHei"/>
-                <w:sz w:val="19"/>
-              </w:rPr>
-              <w:t>19.7s</w:t>
+              <w:t>0.0054</w:t>
             </w:r>
           </w:p>
         </w:tc>
@@ -3655,7 +3479,7 @@
       <w:tr>
         <w:tc>
           <w:tcPr>
-            <w:tcW w:type="dxa" w:w="1872"/>
+            <w:tcW w:type="dxa" w:w="2340"/>
           </w:tcPr>
           <w:p>
             <w:pPr>
@@ -3672,13 +3496,13 @@
                 <w:rFonts w:ascii="Microsoft YaHei" w:hAnsi="Microsoft YaHei"/>
                 <w:sz w:val="19"/>
               </w:rPr>
-              <w:t>LLM Zero-Shot</w:t>
+              <w:t>LLM Few-Shot</w:t>
             </w:r>
           </w:p>
         </w:tc>
         <w:tc>
           <w:tcPr>
-            <w:tcW w:type="dxa" w:w="1872"/>
+            <w:tcW w:type="dxa" w:w="2340"/>
           </w:tcPr>
           <w:p>
             <w:pPr>
@@ -3695,13 +3519,13 @@
                 <w:rFonts w:ascii="Microsoft YaHei" w:hAnsi="Microsoft YaHei"/>
                 <w:sz w:val="19"/>
               </w:rPr>
-              <w:t>0.0083</w:t>
+              <w:t>0.0085</w:t>
             </w:r>
           </w:p>
         </w:tc>
         <w:tc>
           <w:tcPr>
-            <w:tcW w:type="dxa" w:w="1872"/>
+            <w:tcW w:type="dxa" w:w="2340"/>
           </w:tcPr>
           <w:p>
             <w:pPr>
@@ -3724,7 +3548,7 @@
         </w:tc>
         <w:tc>
           <w:tcPr>
-            <w:tcW w:type="dxa" w:w="1872"/>
+            <w:tcW w:type="dxa" w:w="2340"/>
           </w:tcPr>
           <w:p>
             <w:pPr>
@@ -3741,147 +3565,7 @@
                 <w:rFonts w:ascii="Microsoft YaHei" w:hAnsi="Microsoft YaHei"/>
                 <w:sz w:val="19"/>
               </w:rPr>
-              <w:t>0.0054</w:t>
-            </w:r>
-          </w:p>
-        </w:tc>
-        <w:tc>
-          <w:tcPr>
-            <w:tcW w:type="dxa" w:w="1872"/>
-          </w:tcPr>
-          <w:p>
-            <w:pPr>
-              <w:jc w:val="center"/>
-            </w:pPr>
-            <w:r>
-              <w:rPr>
-                <w:rFonts w:ascii="Microsoft YaHei" w:hAnsi="Microsoft YaHei"/>
-                <w:sz w:val="19"/>
-              </w:rPr>
-            </w:r>
-            <w:r>
-              <w:rPr>
-                <w:rFonts w:ascii="Microsoft YaHei" w:hAnsi="Microsoft YaHei"/>
-                <w:sz w:val="19"/>
-              </w:rPr>
-              <w:t>API 耗时约 306s</w:t>
-            </w:r>
-          </w:p>
-        </w:tc>
-      </w:tr>
-      <w:tr>
-        <w:tc>
-          <w:tcPr>
-            <w:tcW w:type="dxa" w:w="1872"/>
-          </w:tcPr>
-          <w:p>
-            <w:pPr>
-              <w:jc w:val="left"/>
-            </w:pPr>
-            <w:r>
-              <w:rPr>
-                <w:rFonts w:ascii="Microsoft YaHei" w:hAnsi="Microsoft YaHei"/>
-                <w:sz w:val="19"/>
-              </w:rPr>
-            </w:r>
-            <w:r>
-              <w:rPr>
-                <w:rFonts w:ascii="Microsoft YaHei" w:hAnsi="Microsoft YaHei"/>
-                <w:sz w:val="19"/>
-              </w:rPr>
-              <w:t>LLM Few-Shot</w:t>
-            </w:r>
-          </w:p>
-        </w:tc>
-        <w:tc>
-          <w:tcPr>
-            <w:tcW w:type="dxa" w:w="1872"/>
-          </w:tcPr>
-          <w:p>
-            <w:pPr>
-              <w:jc w:val="center"/>
-            </w:pPr>
-            <w:r>
-              <w:rPr>
-                <w:rFonts w:ascii="Microsoft YaHei" w:hAnsi="Microsoft YaHei"/>
-                <w:sz w:val="19"/>
-              </w:rPr>
-            </w:r>
-            <w:r>
-              <w:rPr>
-                <w:rFonts w:ascii="Microsoft YaHei" w:hAnsi="Microsoft YaHei"/>
-                <w:sz w:val="19"/>
-              </w:rPr>
-              <w:t>0.0085</w:t>
-            </w:r>
-          </w:p>
-        </w:tc>
-        <w:tc>
-          <w:tcPr>
-            <w:tcW w:type="dxa" w:w="1872"/>
-          </w:tcPr>
-          <w:p>
-            <w:pPr>
-              <w:jc w:val="center"/>
-            </w:pPr>
-            <w:r>
-              <w:rPr>
-                <w:rFonts w:ascii="Microsoft YaHei" w:hAnsi="Microsoft YaHei"/>
-                <w:sz w:val="19"/>
-              </w:rPr>
-            </w:r>
-            <w:r>
-              <w:rPr>
-                <w:rFonts w:ascii="Microsoft YaHei" w:hAnsi="Microsoft YaHei"/>
-                <w:sz w:val="19"/>
-              </w:rPr>
-              <w:t>0.0180</w:t>
-            </w:r>
-          </w:p>
-        </w:tc>
-        <w:tc>
-          <w:tcPr>
-            <w:tcW w:type="dxa" w:w="1872"/>
-          </w:tcPr>
-          <w:p>
-            <w:pPr>
-              <w:jc w:val="center"/>
-            </w:pPr>
-            <w:r>
-              <w:rPr>
-                <w:rFonts w:ascii="Microsoft YaHei" w:hAnsi="Microsoft YaHei"/>
-                <w:sz w:val="19"/>
-              </w:rPr>
-            </w:r>
-            <w:r>
-              <w:rPr>
-                <w:rFonts w:ascii="Microsoft YaHei" w:hAnsi="Microsoft YaHei"/>
-                <w:sz w:val="19"/>
-              </w:rPr>
               <w:t>0.0058</w:t>
-            </w:r>
-          </w:p>
-        </w:tc>
-        <w:tc>
-          <w:tcPr>
-            <w:tcW w:type="dxa" w:w="1872"/>
-          </w:tcPr>
-          <w:p>
-            <w:pPr>
-              <w:jc w:val="center"/>
-            </w:pPr>
-            <w:r>
-              <w:rPr>
-                <w:rFonts w:ascii="Microsoft YaHei" w:hAnsi="Microsoft YaHei"/>
-                <w:sz w:val="19"/>
-              </w:rPr>
-            </w:r>
-            <w:r>
-              <w:rPr>
-                <w:rFonts w:ascii="Microsoft YaHei" w:hAnsi="Microsoft YaHei"/>
-                <w:sz w:val="19"/>
-              </w:rPr>
-              <w:t>API 耗时约 296s</w:t>
             </w:r>
           </w:p>
         </w:tc>
@@ -3915,16 +3599,15 @@
         <w:tblLook w:firstColumn="1" w:firstRow="1" w:lastColumn="0" w:lastRow="0" w:noHBand="0" w:noVBand="1" w:val="04A0"/>
       </w:tblPr>
       <w:tblGrid>
-        <w:gridCol w:w="1872"/>
-        <w:gridCol w:w="1872"/>
-        <w:gridCol w:w="1872"/>
-        <w:gridCol w:w="1872"/>
-        <w:gridCol w:w="1872"/>
+        <w:gridCol w:w="2340"/>
+        <w:gridCol w:w="2340"/>
+        <w:gridCol w:w="2340"/>
+        <w:gridCol w:w="2340"/>
       </w:tblGrid>
       <w:tr>
         <w:tc>
           <w:tcPr>
-            <w:tcW w:type="dxa" w:w="1872"/>
+            <w:tcW w:type="dxa" w:w="2340"/>
           </w:tcPr>
           <w:p>
             <w:pPr>
@@ -3943,7 +3626,7 @@
         </w:tc>
         <w:tc>
           <w:tcPr>
-            <w:tcW w:type="dxa" w:w="1872"/>
+            <w:tcW w:type="dxa" w:w="2340"/>
           </w:tcPr>
           <w:p>
             <w:pPr>
@@ -3962,7 +3645,7 @@
         </w:tc>
         <w:tc>
           <w:tcPr>
-            <w:tcW w:type="dxa" w:w="1872"/>
+            <w:tcW w:type="dxa" w:w="2340"/>
           </w:tcPr>
           <w:p>
             <w:pPr>
@@ -3981,7 +3664,7 @@
         </w:tc>
         <w:tc>
           <w:tcPr>
-            <w:tcW w:type="dxa" w:w="1872"/>
+            <w:tcW w:type="dxa" w:w="2340"/>
           </w:tcPr>
           <w:p>
             <w:pPr>
@@ -3998,22 +3681,97 @@
             </w:r>
           </w:p>
         </w:tc>
+      </w:tr>
+      <w:tr>
         <w:tc>
           <w:tcPr>
-            <w:tcW w:type="dxa" w:w="1872"/>
+            <w:tcW w:type="dxa" w:w="2340"/>
+          </w:tcPr>
+          <w:p>
+            <w:pPr>
+              <w:jc w:val="left"/>
+            </w:pPr>
+            <w:r>
+              <w:rPr>
+                <w:rFonts w:ascii="Microsoft YaHei" w:hAnsi="Microsoft YaHei"/>
+                <w:sz w:val="19"/>
+              </w:rPr>
+            </w:r>
+            <w:r>
+              <w:rPr>
+                <w:rFonts w:ascii="Microsoft YaHei" w:hAnsi="Microsoft YaHei"/>
+                <w:sz w:val="19"/>
+              </w:rPr>
+              <w:t>Popularity</w:t>
+            </w:r>
+          </w:p>
+        </w:tc>
+        <w:tc>
+          <w:tcPr>
+            <w:tcW w:type="dxa" w:w="2340"/>
           </w:tcPr>
           <w:p>
             <w:pPr>
               <w:jc w:val="center"/>
             </w:pPr>
-            <w:r/>
-            <w:r>
-              <w:rPr>
-                <w:rFonts w:ascii="Microsoft YaHei" w:hAnsi="Microsoft YaHei"/>
-                <w:b/>
-                <w:sz w:val="20"/>
-              </w:rPr>
-              <w:t>运行开销 / 推理耗时</w:t>
+            <w:r>
+              <w:rPr>
+                <w:rFonts w:ascii="Microsoft YaHei" w:hAnsi="Microsoft YaHei"/>
+                <w:sz w:val="19"/>
+              </w:rPr>
+            </w:r>
+            <w:r>
+              <w:rPr>
+                <w:rFonts w:ascii="Microsoft YaHei" w:hAnsi="Microsoft YaHei"/>
+                <w:sz w:val="19"/>
+              </w:rPr>
+              <w:t>0.0009</w:t>
+            </w:r>
+          </w:p>
+        </w:tc>
+        <w:tc>
+          <w:tcPr>
+            <w:tcW w:type="dxa" w:w="2340"/>
+          </w:tcPr>
+          <w:p>
+            <w:pPr>
+              <w:jc w:val="center"/>
+            </w:pPr>
+            <w:r>
+              <w:rPr>
+                <w:rFonts w:ascii="Microsoft YaHei" w:hAnsi="Microsoft YaHei"/>
+                <w:sz w:val="19"/>
+              </w:rPr>
+            </w:r>
+            <w:r>
+              <w:rPr>
+                <w:rFonts w:ascii="Microsoft YaHei" w:hAnsi="Microsoft YaHei"/>
+                <w:sz w:val="19"/>
+              </w:rPr>
+              <w:t>0.0021</w:t>
+            </w:r>
+          </w:p>
+        </w:tc>
+        <w:tc>
+          <w:tcPr>
+            <w:tcW w:type="dxa" w:w="2340"/>
+          </w:tcPr>
+          <w:p>
+            <w:pPr>
+              <w:jc w:val="center"/>
+            </w:pPr>
+            <w:r>
+              <w:rPr>
+                <w:rFonts w:ascii="Microsoft YaHei" w:hAnsi="Microsoft YaHei"/>
+                <w:sz w:val="19"/>
+              </w:rPr>
+            </w:r>
+            <w:r>
+              <w:rPr>
+                <w:rFonts w:ascii="Microsoft YaHei" w:hAnsi="Microsoft YaHei"/>
+                <w:sz w:val="19"/>
+              </w:rPr>
+              <w:t>0.0006</w:t>
             </w:r>
           </w:p>
         </w:tc>
@@ -4021,7 +3779,7 @@
       <w:tr>
         <w:tc>
           <w:tcPr>
-            <w:tcW w:type="dxa" w:w="1872"/>
+            <w:tcW w:type="dxa" w:w="2340"/>
           </w:tcPr>
           <w:p>
             <w:pPr>
@@ -4038,13 +3796,13 @@
                 <w:rFonts w:ascii="Microsoft YaHei" w:hAnsi="Microsoft YaHei"/>
                 <w:sz w:val="19"/>
               </w:rPr>
-              <w:t>Popularity</w:t>
+              <w:t>BPR 🚀</w:t>
             </w:r>
           </w:p>
         </w:tc>
         <w:tc>
           <w:tcPr>
-            <w:tcW w:type="dxa" w:w="1872"/>
+            <w:tcW w:type="dxa" w:w="2340"/>
           </w:tcPr>
           <w:p>
             <w:pPr>
@@ -4061,13 +3819,13 @@
                 <w:rFonts w:ascii="Microsoft YaHei" w:hAnsi="Microsoft YaHei"/>
                 <w:sz w:val="19"/>
               </w:rPr>
-              <w:t>0.0009</w:t>
+              <w:t>0.0358</w:t>
             </w:r>
           </w:p>
         </w:tc>
         <w:tc>
           <w:tcPr>
-            <w:tcW w:type="dxa" w:w="1872"/>
+            <w:tcW w:type="dxa" w:w="2340"/>
           </w:tcPr>
           <w:p>
             <w:pPr>
@@ -4084,13 +3842,13 @@
                 <w:rFonts w:ascii="Microsoft YaHei" w:hAnsi="Microsoft YaHei"/>
                 <w:sz w:val="19"/>
               </w:rPr>
-              <w:t>0.0021</w:t>
+              <w:t>0.0626</w:t>
             </w:r>
           </w:p>
         </w:tc>
         <w:tc>
           <w:tcPr>
-            <w:tcW w:type="dxa" w:w="1872"/>
+            <w:tcW w:type="dxa" w:w="2340"/>
           </w:tcPr>
           <w:p>
             <w:pPr>
@@ -4107,30 +3865,7 @@
                 <w:rFonts w:ascii="Microsoft YaHei" w:hAnsi="Microsoft YaHei"/>
                 <w:sz w:val="19"/>
               </w:rPr>
-              <w:t>0.0006</w:t>
-            </w:r>
-          </w:p>
-        </w:tc>
-        <w:tc>
-          <w:tcPr>
-            <w:tcW w:type="dxa" w:w="1872"/>
-          </w:tcPr>
-          <w:p>
-            <w:pPr>
-              <w:jc w:val="center"/>
-            </w:pPr>
-            <w:r>
-              <w:rPr>
-                <w:rFonts w:ascii="Microsoft YaHei" w:hAnsi="Microsoft YaHei"/>
-                <w:sz w:val="19"/>
-              </w:rPr>
-            </w:r>
-            <w:r>
-              <w:rPr>
-                <w:rFonts w:ascii="Microsoft YaHei" w:hAnsi="Microsoft YaHei"/>
-                <w:sz w:val="19"/>
-              </w:rPr>
-              <w:t>2.1s</w:t>
+              <w:t>0.0277</w:t>
             </w:r>
           </w:p>
         </w:tc>
@@ -4138,7 +3873,7 @@
       <w:tr>
         <w:tc>
           <w:tcPr>
-            <w:tcW w:type="dxa" w:w="1872"/>
+            <w:tcW w:type="dxa" w:w="2340"/>
           </w:tcPr>
           <w:p>
             <w:pPr>
@@ -4155,13 +3890,13 @@
                 <w:rFonts w:ascii="Microsoft YaHei" w:hAnsi="Microsoft YaHei"/>
                 <w:sz w:val="19"/>
               </w:rPr>
-              <w:t>BPR_Ultra 🚀</w:t>
+              <w:t>SASRec</w:t>
             </w:r>
           </w:p>
         </w:tc>
         <w:tc>
           <w:tcPr>
-            <w:tcW w:type="dxa" w:w="1872"/>
+            <w:tcW w:type="dxa" w:w="2340"/>
           </w:tcPr>
           <w:p>
             <w:pPr>
@@ -4178,13 +3913,13 @@
                 <w:rFonts w:ascii="Microsoft YaHei" w:hAnsi="Microsoft YaHei"/>
                 <w:sz w:val="19"/>
               </w:rPr>
-              <w:t>0.0358</w:t>
+              <w:t>0.0017</w:t>
             </w:r>
           </w:p>
         </w:tc>
         <w:tc>
           <w:tcPr>
-            <w:tcW w:type="dxa" w:w="1872"/>
+            <w:tcW w:type="dxa" w:w="2340"/>
           </w:tcPr>
           <w:p>
             <w:pPr>
@@ -4201,13 +3936,13 @@
                 <w:rFonts w:ascii="Microsoft YaHei" w:hAnsi="Microsoft YaHei"/>
                 <w:sz w:val="19"/>
               </w:rPr>
-              <w:t>0.0626</w:t>
+              <w:t>0.0036</w:t>
             </w:r>
           </w:p>
         </w:tc>
         <w:tc>
           <w:tcPr>
-            <w:tcW w:type="dxa" w:w="1872"/>
+            <w:tcW w:type="dxa" w:w="2340"/>
           </w:tcPr>
           <w:p>
             <w:pPr>
@@ -4224,30 +3959,7 @@
                 <w:rFonts w:ascii="Microsoft YaHei" w:hAnsi="Microsoft YaHei"/>
                 <w:sz w:val="19"/>
               </w:rPr>
-              <w:t>0.0277</w:t>
-            </w:r>
-          </w:p>
-        </w:tc>
-        <w:tc>
-          <w:tcPr>
-            <w:tcW w:type="dxa" w:w="1872"/>
-          </w:tcPr>
-          <w:p>
-            <w:pPr>
-              <w:jc w:val="center"/>
-            </w:pPr>
-            <w:r>
-              <w:rPr>
-                <w:rFonts w:ascii="Microsoft YaHei" w:hAnsi="Microsoft YaHei"/>
-                <w:sz w:val="19"/>
-              </w:rPr>
-            </w:r>
-            <w:r>
-              <w:rPr>
-                <w:rFonts w:ascii="Microsoft YaHei" w:hAnsi="Microsoft YaHei"/>
-                <w:sz w:val="19"/>
-              </w:rPr>
-              <w:t>56.0s (V100 向量化)</w:t>
+              <w:t>0.0011</w:t>
             </w:r>
           </w:p>
         </w:tc>
@@ -4255,7 +3967,7 @@
       <w:tr>
         <w:tc>
           <w:tcPr>
-            <w:tcW w:type="dxa" w:w="1872"/>
+            <w:tcW w:type="dxa" w:w="2340"/>
           </w:tcPr>
           <w:p>
             <w:pPr>
@@ -4270,15 +3982,23 @@
             <w:r>
               <w:rPr>
                 <w:rFonts w:ascii="Microsoft YaHei" w:hAnsi="Microsoft YaHei"/>
-                <w:sz w:val="19"/>
-              </w:rPr>
-              <w:t>SASRec</w:t>
+                <w:b/>
+                <w:sz w:val="19"/>
+              </w:rPr>
+              <w:t>LLM Zero-Shot</w:t>
+            </w:r>
+            <w:r>
+              <w:rPr>
+                <w:rFonts w:ascii="Microsoft YaHei" w:hAnsi="Microsoft YaHei"/>
+                <w:sz w:val="19"/>
+              </w:rPr>
+              <w:t xml:space="preserve"> 🏆</w:t>
             </w:r>
           </w:p>
         </w:tc>
         <w:tc>
           <w:tcPr>
-            <w:tcW w:type="dxa" w:w="1872"/>
+            <w:tcW w:type="dxa" w:w="2340"/>
           </w:tcPr>
           <w:p>
             <w:pPr>
@@ -4293,15 +4013,16 @@
             <w:r>
               <w:rPr>
                 <w:rFonts w:ascii="Microsoft YaHei" w:hAnsi="Microsoft YaHei"/>
-                <w:sz w:val="19"/>
-              </w:rPr>
-              <w:t>0.0017</w:t>
+                <w:b/>
+                <w:sz w:val="19"/>
+              </w:rPr>
+              <w:t>0.0373</w:t>
             </w:r>
           </w:p>
         </w:tc>
         <w:tc>
           <w:tcPr>
-            <w:tcW w:type="dxa" w:w="1872"/>
+            <w:tcW w:type="dxa" w:w="2340"/>
           </w:tcPr>
           <w:p>
             <w:pPr>
@@ -4316,15 +4037,16 @@
             <w:r>
               <w:rPr>
                 <w:rFonts w:ascii="Microsoft YaHei" w:hAnsi="Microsoft YaHei"/>
-                <w:sz w:val="19"/>
-              </w:rPr>
-              <w:t>0.0036</w:t>
+                <w:b/>
+                <w:sz w:val="19"/>
+              </w:rPr>
+              <w:t>0.0620</w:t>
             </w:r>
           </w:p>
         </w:tc>
         <w:tc>
           <w:tcPr>
-            <w:tcW w:type="dxa" w:w="1872"/>
+            <w:tcW w:type="dxa" w:w="2340"/>
           </w:tcPr>
           <w:p>
             <w:pPr>
@@ -4339,32 +4061,10 @@
             <w:r>
               <w:rPr>
                 <w:rFonts w:ascii="Microsoft YaHei" w:hAnsi="Microsoft YaHei"/>
-                <w:sz w:val="19"/>
-              </w:rPr>
-              <w:t>0.0011</w:t>
-            </w:r>
-          </w:p>
-        </w:tc>
-        <w:tc>
-          <w:tcPr>
-            <w:tcW w:type="dxa" w:w="1872"/>
-          </w:tcPr>
-          <w:p>
-            <w:pPr>
-              <w:jc w:val="center"/>
-            </w:pPr>
-            <w:r>
-              <w:rPr>
-                <w:rFonts w:ascii="Microsoft YaHei" w:hAnsi="Microsoft YaHei"/>
-                <w:sz w:val="19"/>
-              </w:rPr>
-            </w:r>
-            <w:r>
-              <w:rPr>
-                <w:rFonts w:ascii="Microsoft YaHei" w:hAnsi="Microsoft YaHei"/>
-                <w:sz w:val="19"/>
-              </w:rPr>
-              <w:t>52.0s</w:t>
+                <w:b/>
+                <w:sz w:val="19"/>
+              </w:rPr>
+              <w:t>0.0295</w:t>
             </w:r>
           </w:p>
         </w:tc>
@@ -4372,7 +4072,7 @@
       <w:tr>
         <w:tc>
           <w:tcPr>
-            <w:tcW w:type="dxa" w:w="1872"/>
+            <w:tcW w:type="dxa" w:w="2340"/>
           </w:tcPr>
           <w:p>
             <w:pPr>
@@ -4387,23 +4087,15 @@
             <w:r>
               <w:rPr>
                 <w:rFonts w:ascii="Microsoft YaHei" w:hAnsi="Microsoft YaHei"/>
-                <w:b/>
-                <w:sz w:val="19"/>
-              </w:rPr>
-              <w:t>LLM Zero-Shot</w:t>
-            </w:r>
-            <w:r>
-              <w:rPr>
-                <w:rFonts w:ascii="Microsoft YaHei" w:hAnsi="Microsoft YaHei"/>
-                <w:sz w:val="19"/>
-              </w:rPr>
-              <w:t xml:space="preserve"> 🏆</w:t>
+                <w:sz w:val="19"/>
+              </w:rPr>
+              <w:t>LLM Few-Shot</w:t>
             </w:r>
           </w:p>
         </w:tc>
         <w:tc>
           <w:tcPr>
-            <w:tcW w:type="dxa" w:w="1872"/>
+            <w:tcW w:type="dxa" w:w="2340"/>
           </w:tcPr>
           <w:p>
             <w:pPr>
@@ -4418,16 +4110,15 @@
             <w:r>
               <w:rPr>
                 <w:rFonts w:ascii="Microsoft YaHei" w:hAnsi="Microsoft YaHei"/>
-                <w:b/>
-                <w:sz w:val="19"/>
-              </w:rPr>
-              <w:t>0.0373</w:t>
+                <w:sz w:val="19"/>
+              </w:rPr>
+              <w:t>0.0357</w:t>
             </w:r>
           </w:p>
         </w:tc>
         <w:tc>
           <w:tcPr>
-            <w:tcW w:type="dxa" w:w="1872"/>
+            <w:tcW w:type="dxa" w:w="2340"/>
           </w:tcPr>
           <w:p>
             <w:pPr>
@@ -4442,16 +4133,15 @@
             <w:r>
               <w:rPr>
                 <w:rFonts w:ascii="Microsoft YaHei" w:hAnsi="Microsoft YaHei"/>
-                <w:b/>
-                <w:sz w:val="19"/>
-              </w:rPr>
-              <w:t>0.0620</w:t>
+                <w:sz w:val="19"/>
+              </w:rPr>
+              <w:t>0.0640</w:t>
             </w:r>
           </w:p>
         </w:tc>
         <w:tc>
           <w:tcPr>
-            <w:tcW w:type="dxa" w:w="1872"/>
+            <w:tcW w:type="dxa" w:w="2340"/>
           </w:tcPr>
           <w:p>
             <w:pPr>
@@ -4466,150 +4156,9 @@
             <w:r>
               <w:rPr>
                 <w:rFonts w:ascii="Microsoft YaHei" w:hAnsi="Microsoft YaHei"/>
-                <w:b/>
-                <w:sz w:val="19"/>
-              </w:rPr>
-              <w:t>0.0295</w:t>
-            </w:r>
-          </w:p>
-        </w:tc>
-        <w:tc>
-          <w:tcPr>
-            <w:tcW w:type="dxa" w:w="1872"/>
-          </w:tcPr>
-          <w:p>
-            <w:pPr>
-              <w:jc w:val="center"/>
-            </w:pPr>
-            <w:r>
-              <w:rPr>
-                <w:rFonts w:ascii="Microsoft YaHei" w:hAnsi="Microsoft YaHei"/>
-                <w:sz w:val="19"/>
-              </w:rPr>
-            </w:r>
-            <w:r>
-              <w:rPr>
-                <w:rFonts w:ascii="Microsoft YaHei" w:hAnsi="Microsoft YaHei"/>
-                <w:sz w:val="19"/>
-              </w:rPr>
-              <w:t>API 耗时约 1408s</w:t>
-            </w:r>
-          </w:p>
-        </w:tc>
-      </w:tr>
-      <w:tr>
-        <w:tc>
-          <w:tcPr>
-            <w:tcW w:type="dxa" w:w="1872"/>
-          </w:tcPr>
-          <w:p>
-            <w:pPr>
-              <w:jc w:val="left"/>
-            </w:pPr>
-            <w:r>
-              <w:rPr>
-                <w:rFonts w:ascii="Microsoft YaHei" w:hAnsi="Microsoft YaHei"/>
-                <w:sz w:val="19"/>
-              </w:rPr>
-            </w:r>
-            <w:r>
-              <w:rPr>
-                <w:rFonts w:ascii="Microsoft YaHei" w:hAnsi="Microsoft YaHei"/>
-                <w:sz w:val="19"/>
-              </w:rPr>
-              <w:t>LLM Few-Shot</w:t>
-            </w:r>
-          </w:p>
-        </w:tc>
-        <w:tc>
-          <w:tcPr>
-            <w:tcW w:type="dxa" w:w="1872"/>
-          </w:tcPr>
-          <w:p>
-            <w:pPr>
-              <w:jc w:val="center"/>
-            </w:pPr>
-            <w:r>
-              <w:rPr>
-                <w:rFonts w:ascii="Microsoft YaHei" w:hAnsi="Microsoft YaHei"/>
-                <w:sz w:val="19"/>
-              </w:rPr>
-            </w:r>
-            <w:r>
-              <w:rPr>
-                <w:rFonts w:ascii="Microsoft YaHei" w:hAnsi="Microsoft YaHei"/>
-                <w:sz w:val="19"/>
-              </w:rPr>
-              <w:t>0.0357</w:t>
-            </w:r>
-          </w:p>
-        </w:tc>
-        <w:tc>
-          <w:tcPr>
-            <w:tcW w:type="dxa" w:w="1872"/>
-          </w:tcPr>
-          <w:p>
-            <w:pPr>
-              <w:jc w:val="center"/>
-            </w:pPr>
-            <w:r>
-              <w:rPr>
-                <w:rFonts w:ascii="Microsoft YaHei" w:hAnsi="Microsoft YaHei"/>
-                <w:sz w:val="19"/>
-              </w:rPr>
-            </w:r>
-            <w:r>
-              <w:rPr>
-                <w:rFonts w:ascii="Microsoft YaHei" w:hAnsi="Microsoft YaHei"/>
-                <w:sz w:val="19"/>
-              </w:rPr>
-              <w:t>0.0640</w:t>
-            </w:r>
-          </w:p>
-        </w:tc>
-        <w:tc>
-          <w:tcPr>
-            <w:tcW w:type="dxa" w:w="1872"/>
-          </w:tcPr>
-          <w:p>
-            <w:pPr>
-              <w:jc w:val="center"/>
-            </w:pPr>
-            <w:r>
-              <w:rPr>
-                <w:rFonts w:ascii="Microsoft YaHei" w:hAnsi="Microsoft YaHei"/>
-                <w:sz w:val="19"/>
-              </w:rPr>
-            </w:r>
-            <w:r>
-              <w:rPr>
-                <w:rFonts w:ascii="Microsoft YaHei" w:hAnsi="Microsoft YaHei"/>
                 <w:sz w:val="19"/>
               </w:rPr>
               <w:t>0.0266</w:t>
-            </w:r>
-          </w:p>
-        </w:tc>
-        <w:tc>
-          <w:tcPr>
-            <w:tcW w:type="dxa" w:w="1872"/>
-          </w:tcPr>
-          <w:p>
-            <w:pPr>
-              <w:jc w:val="center"/>
-            </w:pPr>
-            <w:r>
-              <w:rPr>
-                <w:rFonts w:ascii="Microsoft YaHei" w:hAnsi="Microsoft YaHei"/>
-                <w:sz w:val="19"/>
-              </w:rPr>
-            </w:r>
-            <w:r>
-              <w:rPr>
-                <w:rFonts w:ascii="Microsoft YaHei" w:hAnsi="Microsoft YaHei"/>
-                <w:sz w:val="19"/>
-              </w:rPr>
-              <w:t>API 耗时约 1391s</w:t>
             </w:r>
           </w:p>
         </w:tc>
@@ -5003,7 +4552,7 @@
                 <w:b/>
                 <w:sz w:val="19"/>
               </w:rPr>
-              <w:t>BPR_Ultra</w:t>
+              <w:t>BPR</w:t>
             </w:r>
             <w:r>
               <w:rPr>
@@ -5497,7 +5046,7 @@
           <w:color w:val="646E78"/>
           <w:sz w:val="22"/>
         </w:rPr>
-        <w:t>4.4.1 BPR_Ultra 模型分析</w:t>
+        <w:t>4.4.1 BPR 模型分析</w:t>
       </w:r>
     </w:p>
     <w:p>
@@ -5509,7 +5058,7 @@
           <w:rFonts w:ascii="Microsoft YaHei" w:hAnsi="Microsoft YaHei"/>
           <w:sz w:val="21"/>
         </w:rPr>
-        <w:t>BPR_Ultra 基于 Bayesian Personalized Ranking 的成对排序损失，使用历史序列动态生成用户表示——长期兴趣取历史商品 embedding 的均值，短期兴趣取序列最后一项，以 σ(α) 自适应加权融合，并加入物品偏置 b_i 将静态热度与动态匹配度解耦。</w:t>
+        <w:t>BPR 基于 Bayesian Personalized Ranking 的成对排序损失，使用历史序列动态生成用户表示——长期兴趣取历史商品 embedding 的均值，短期兴趣取序列最后一项，以 σ(α) 自适应加权融合，并加入物品偏置 b_i 将静态热度与动态匹配度解耦。</w:t>
       </w:r>
     </w:p>
     <w:p>
@@ -5521,7 +5070,7 @@
           <w:rFonts w:ascii="Microsoft YaHei" w:hAnsi="Microsoft YaHei"/>
           <w:sz w:val="21"/>
         </w:rPr>
-        <w:t xml:space="preserve">BPR_Ultra 在 </w:t>
+        <w:t xml:space="preserve">在 </w:t>
       </w:r>
       <w:r>
         <w:rPr>
@@ -5536,7 +5085,7 @@
           <w:rFonts w:ascii="Microsoft YaHei" w:hAnsi="Microsoft YaHei"/>
           <w:sz w:val="21"/>
         </w:rPr>
-        <w:t xml:space="preserve"> 上 NDCG@10 = 0.0209，在 </w:t>
+        <w:t xml:space="preserve"> 上 BPR 的 NDCG@10 = 0.0209，在 </w:t>
       </w:r>
       <w:r>
         <w:rPr>
@@ -5578,7 +5127,7 @@
           <w:rFonts w:ascii="Microsoft YaHei" w:hAnsi="Microsoft YaHei"/>
           <w:sz w:val="21"/>
         </w:rPr>
-        <w:t xml:space="preserve"> 上 BPR_Ultra 达 0.0358，为三个品类中最高，逼近 LLM Zero-Shot 的 0.0373。CDs 是最大最稀疏的品类（89K 物品），较大的隐空间提供了足够容量区分海量物品的精细差异。BPR_Ultra 三品类平均 NDCG@10 为 </w:t>
+        <w:t xml:space="preserve"> 上 BPR 达 0.0358，为三个品类中最高，逼近 LLM Zero-Shot 的 0.0373。CDs 是最大最稀疏的品类（89K 物品），较大的隐空间提供了足够容量区分海量物品的精细差异。BPR 三品类平均 NDCG@10 为 </w:t>
       </w:r>
       <w:r>
         <w:rPr>
@@ -5605,7 +5154,7 @@
           <w:rFonts w:ascii="Microsoft YaHei" w:hAnsi="Microsoft YaHei"/>
           <w:sz w:val="21"/>
         </w:rPr>
-        <w:t>适用场景：BPR_Ultra 适合用户交互序列可获取的推荐场景，在品类规模较大、物品多样性高时优势尤其明显。</w:t>
+        <w:t>适用场景：BPR 适合用户交互序列可获取的推荐场景，在品类规模较大、物品多样性高时优势尤其明显。</w:t>
       </w:r>
     </w:p>
     <w:p>
@@ -5632,7 +5181,7 @@
           <w:rFonts w:ascii="Microsoft YaHei" w:hAnsi="Microsoft YaHei"/>
           <w:sz w:val="21"/>
         </w:rPr>
-        <w:t>CDs 是三个数据集里最稀疏的，ItemCF 因内存原因直接跳过，SASRec 的 NDCG@10 也只有 0.0017。LLM Zero-Shot 拿到 0.0373 的全品类最高分，BPR_Ultra 以 0.0358 紧随其后。</w:t>
+        <w:t>CDs 是三个数据集里最稀疏的，ItemCF 因内存原因直接跳过，SASRec 的 NDCG@10 也只有 0.0017。LLM Zero-Shot 拿到 0.0373 的全品类最高分，BPR 以 0.0358 紧随其后。</w:t>
       </w:r>
     </w:p>
     <w:p>
@@ -5671,7 +5220,7 @@
           <w:rFonts w:ascii="Microsoft YaHei" w:hAnsi="Microsoft YaHei"/>
           <w:sz w:val="21"/>
         </w:rPr>
-        <w:t>理论上自注意力能捕捉长距离依赖，但 SASRec 在三个品类上都明显弱于 BPR_Ultra。原因是 5-Core 数据集里多数用户的交互序列偏短，Transformer 的多头注意力和前馈层参数较多，训练信号不足以稳定收敛。BPR_Ultra 的成对排序损失在每个三元组上直接更新隐向量，梯度密度更高，在轻交互场景里更稳。这并非 SASRec 模型本身有问题，而是数据规模与模型容量不匹配。</w:t>
+        <w:t>理论上自注意力能捕捉长距离依赖，但 SASRec 在三个品类上都明显弱于 BPR。原因是 5-Core 数据集里多数用户的交互序列偏短，Transformer 的多头注意力和前馈层参数较多，训练信号不足以稳定收敛。BPR 的成对排序损失在每个三元组上直接更新隐向量，梯度密度更高，在轻交互场景里更稳。这并非 SASRec 模型本身有问题，而是数据规模与模型容量不匹配。</w:t>
       </w:r>
     </w:p>
     <w:p>
@@ -6063,7 +5612,7 @@
           <w:color w:val="34495E"/>
           <w:sz w:val="24"/>
         </w:rPr>
-        <w:t>5.2 软件依赖</w:t>
+        <w:t>5.2 超参数配置（Hyperparameters）</w:t>
       </w:r>
     </w:p>
     <w:tbl>
@@ -6074,14 +5623,13 @@
         <w:tblLook w:firstColumn="1" w:firstRow="1" w:lastColumn="0" w:lastRow="0" w:noHBand="0" w:noVBand="1" w:val="04A0"/>
       </w:tblPr>
       <w:tblGrid>
-        <w:gridCol w:w="3120"/>
-        <w:gridCol w:w="3120"/>
-        <w:gridCol w:w="3120"/>
+        <w:gridCol w:w="4680"/>
+        <w:gridCol w:w="4680"/>
       </w:tblGrid>
       <w:tr>
         <w:tc>
           <w:tcPr>
-            <w:tcW w:type="dxa" w:w="3120"/>
+            <w:tcW w:type="dxa" w:w="4680"/>
           </w:tcPr>
           <w:p>
             <w:pPr>
@@ -6094,13 +5642,13 @@
                 <w:b/>
                 <w:sz w:val="20"/>
               </w:rPr>
-              <w:t>库/组件 (Library)</w:t>
+              <w:t>参数 (Hyperparameter)</w:t>
             </w:r>
           </w:p>
         </w:tc>
         <w:tc>
           <w:tcPr>
-            <w:tcW w:type="dxa" w:w="3120"/>
+            <w:tcW w:type="dxa" w:w="4680"/>
           </w:tcPr>
           <w:p>
             <w:pPr>
@@ -6113,26 +5661,7 @@
                 <w:b/>
                 <w:sz w:val="20"/>
               </w:rPr>
-              <w:t>推荐版本 (Version)</w:t>
-            </w:r>
-          </w:p>
-        </w:tc>
-        <w:tc>
-          <w:tcPr>
-            <w:tcW w:type="dxa" w:w="3120"/>
-          </w:tcPr>
-          <w:p>
-            <w:pPr>
-              <w:jc w:val="center"/>
-            </w:pPr>
-            <w:r/>
-            <w:r>
-              <w:rPr>
-                <w:rFonts w:ascii="Microsoft YaHei" w:hAnsi="Microsoft YaHei"/>
-                <w:b/>
-                <w:sz w:val="20"/>
-              </w:rPr>
-              <w:t>用途说明</w:t>
+              <w:t>配置值 (Config Value)</w:t>
             </w:r>
           </w:p>
         </w:tc>
@@ -6140,7 +5669,7 @@
       <w:tr>
         <w:tc>
           <w:tcPr>
-            <w:tcW w:type="dxa" w:w="3120"/>
+            <w:tcW w:type="dxa" w:w="4680"/>
           </w:tcPr>
           <w:p>
             <w:pPr>
@@ -6158,13 +5687,13 @@
                 <w:b/>
                 <w:sz w:val="19"/>
               </w:rPr>
-              <w:t>Python</w:t>
+              <w:t>Embedding Dim (BPR)</w:t>
             </w:r>
           </w:p>
         </w:tc>
         <w:tc>
           <w:tcPr>
-            <w:tcW w:type="dxa" w:w="3120"/>
+            <w:tcW w:type="dxa" w:w="4680"/>
           </w:tcPr>
           <w:p>
             <w:pPr>
@@ -6181,30 +5710,7 @@
                 <w:rFonts w:ascii="Microsoft YaHei" w:hAnsi="Microsoft YaHei"/>
                 <w:sz w:val="19"/>
               </w:rPr>
-              <w:t>3.10.6</w:t>
-            </w:r>
-          </w:p>
-        </w:tc>
-        <w:tc>
-          <w:tcPr>
-            <w:tcW w:type="dxa" w:w="3120"/>
-          </w:tcPr>
-          <w:p>
-            <w:pPr>
-              <w:jc w:val="center"/>
-            </w:pPr>
-            <w:r>
-              <w:rPr>
-                <w:rFonts w:ascii="Microsoft YaHei" w:hAnsi="Microsoft YaHei"/>
-                <w:sz w:val="19"/>
-              </w:rPr>
-            </w:r>
-            <w:r>
-              <w:rPr>
-                <w:rFonts w:ascii="Microsoft YaHei" w:hAnsi="Microsoft YaHei"/>
-                <w:sz w:val="19"/>
-              </w:rPr>
-              <w:t>核心运行编程语言环境</w:t>
+              <w:t>128</w:t>
             </w:r>
           </w:p>
         </w:tc>
@@ -6212,7 +5718,7 @@
       <w:tr>
         <w:tc>
           <w:tcPr>
-            <w:tcW w:type="dxa" w:w="3120"/>
+            <w:tcW w:type="dxa" w:w="4680"/>
           </w:tcPr>
           <w:p>
             <w:pPr>
@@ -6230,13 +5736,13 @@
                 <w:b/>
                 <w:sz w:val="19"/>
               </w:rPr>
-              <w:t>PyTorch</w:t>
+              <w:t>Batch Size</w:t>
             </w:r>
           </w:p>
         </w:tc>
         <w:tc>
           <w:tcPr>
-            <w:tcW w:type="dxa" w:w="3120"/>
+            <w:tcW w:type="dxa" w:w="4680"/>
           </w:tcPr>
           <w:p>
             <w:pPr>
@@ -6253,30 +5759,7 @@
                 <w:rFonts w:ascii="Microsoft YaHei" w:hAnsi="Microsoft YaHei"/>
                 <w:sz w:val="19"/>
               </w:rPr>
-              <w:t>1.12.1+cu113</w:t>
-            </w:r>
-          </w:p>
-        </w:tc>
-        <w:tc>
-          <w:tcPr>
-            <w:tcW w:type="dxa" w:w="3120"/>
-          </w:tcPr>
-          <w:p>
-            <w:pPr>
-              <w:jc w:val="center"/>
-            </w:pPr>
-            <w:r>
-              <w:rPr>
-                <w:rFonts w:ascii="Microsoft YaHei" w:hAnsi="Microsoft YaHei"/>
-                <w:sz w:val="19"/>
-              </w:rPr>
-            </w:r>
-            <w:r>
-              <w:rPr>
-                <w:rFonts w:ascii="Microsoft YaHei" w:hAnsi="Microsoft YaHei"/>
-                <w:sz w:val="19"/>
-              </w:rPr>
-              <w:t>深度模型 SASRec 与 BPR 系列训练的底层张量框架</w:t>
+              <w:t>16384</w:t>
             </w:r>
           </w:p>
         </w:tc>
@@ -6284,7 +5767,7 @@
       <w:tr>
         <w:tc>
           <w:tcPr>
-            <w:tcW w:type="dxa" w:w="3120"/>
+            <w:tcW w:type="dxa" w:w="4680"/>
           </w:tcPr>
           <w:p>
             <w:pPr>
@@ -6302,13 +5785,13 @@
                 <w:b/>
                 <w:sz w:val="19"/>
               </w:rPr>
-              <w:t>CUDA Driver</w:t>
+              <w:t>Learning Rate</w:t>
             </w:r>
           </w:p>
         </w:tc>
         <w:tc>
           <w:tcPr>
-            <w:tcW w:type="dxa" w:w="3120"/>
+            <w:tcW w:type="dxa" w:w="4680"/>
           </w:tcPr>
           <w:p>
             <w:pPr>
@@ -6325,30 +5808,7 @@
                 <w:rFonts w:ascii="Microsoft YaHei" w:hAnsi="Microsoft YaHei"/>
                 <w:sz w:val="19"/>
               </w:rPr>
-              <w:t>470.223.02 (NV CUDA 11.3)</w:t>
-            </w:r>
-          </w:p>
-        </w:tc>
-        <w:tc>
-          <w:tcPr>
-            <w:tcW w:type="dxa" w:w="3120"/>
-          </w:tcPr>
-          <w:p>
-            <w:pPr>
-              <w:jc w:val="center"/>
-            </w:pPr>
-            <w:r>
-              <w:rPr>
-                <w:rFonts w:ascii="Microsoft YaHei" w:hAnsi="Microsoft YaHei"/>
-                <w:sz w:val="19"/>
-              </w:rPr>
-            </w:r>
-            <w:r>
-              <w:rPr>
-                <w:rFonts w:ascii="Microsoft YaHei" w:hAnsi="Microsoft YaHei"/>
-                <w:sz w:val="19"/>
-              </w:rPr>
-              <w:t>GPU 底层加速算子库支持</w:t>
+              <w:t>2e-3 (AdamW)</w:t>
             </w:r>
           </w:p>
         </w:tc>
@@ -6356,7 +5816,7 @@
       <w:tr>
         <w:tc>
           <w:tcPr>
-            <w:tcW w:type="dxa" w:w="3120"/>
+            <w:tcW w:type="dxa" w:w="4680"/>
           </w:tcPr>
           <w:p>
             <w:pPr>
@@ -6374,13 +5834,13 @@
                 <w:b/>
                 <w:sz w:val="19"/>
               </w:rPr>
-              <w:t>Pandas / NumPy</w:t>
+              <w:t>Negative K</w:t>
             </w:r>
           </w:p>
         </w:tc>
         <w:tc>
           <w:tcPr>
-            <w:tcW w:type="dxa" w:w="3120"/>
+            <w:tcW w:type="dxa" w:w="4680"/>
           </w:tcPr>
           <w:p>
             <w:pPr>
@@ -6397,30 +5857,7 @@
                 <w:rFonts w:ascii="Microsoft YaHei" w:hAnsi="Microsoft YaHei"/>
                 <w:sz w:val="19"/>
               </w:rPr>
-              <w:t>2.0.0+ / 1.23.0+</w:t>
-            </w:r>
-          </w:p>
-        </w:tc>
-        <w:tc>
-          <w:tcPr>
-            <w:tcW w:type="dxa" w:w="3120"/>
-          </w:tcPr>
-          <w:p>
-            <w:pPr>
-              <w:jc w:val="center"/>
-            </w:pPr>
-            <w:r>
-              <w:rPr>
-                <w:rFonts w:ascii="Microsoft YaHei" w:hAnsi="Microsoft YaHei"/>
-                <w:sz w:val="19"/>
-              </w:rPr>
-            </w:r>
-            <w:r>
-              <w:rPr>
-                <w:rFonts w:ascii="Microsoft YaHei" w:hAnsi="Microsoft YaHei"/>
-                <w:sz w:val="19"/>
-              </w:rPr>
-              <w:t>数据集高效流式读取、截断切片及数学向量运算</w:t>
+              <w:t>5</w:t>
             </w:r>
           </w:p>
         </w:tc>
@@ -6428,7 +5865,7 @@
       <w:tr>
         <w:tc>
           <w:tcPr>
-            <w:tcW w:type="dxa" w:w="3120"/>
+            <w:tcW w:type="dxa" w:w="4680"/>
           </w:tcPr>
           <w:p>
             <w:pPr>
@@ -6446,13 +5883,13 @@
                 <w:b/>
                 <w:sz w:val="19"/>
               </w:rPr>
-              <w:t>python-docx</w:t>
+              <w:t>Dropout</w:t>
             </w:r>
           </w:p>
         </w:tc>
         <w:tc>
           <w:tcPr>
-            <w:tcW w:type="dxa" w:w="3120"/>
+            <w:tcW w:type="dxa" w:w="4680"/>
           </w:tcPr>
           <w:p>
             <w:pPr>
@@ -6469,122 +5906,7 @@
                 <w:rFonts w:ascii="Microsoft YaHei" w:hAnsi="Microsoft YaHei"/>
                 <w:sz w:val="19"/>
               </w:rPr>
-              <w:t>0.8.11</w:t>
-            </w:r>
-          </w:p>
-        </w:tc>
-        <w:tc>
-          <w:tcPr>
-            <w:tcW w:type="dxa" w:w="3120"/>
-          </w:tcPr>
-          <w:p>
-            <w:pPr>
-              <w:jc w:val="center"/>
-            </w:pPr>
-            <w:r>
-              <w:rPr>
-                <w:rFonts w:ascii="Microsoft YaHei" w:hAnsi="Microsoft YaHei"/>
-                <w:sz w:val="19"/>
-              </w:rPr>
-            </w:r>
-            <w:r>
-              <w:rPr>
-                <w:rFonts w:ascii="Microsoft YaHei" w:hAnsi="Microsoft YaHei"/>
-                <w:sz w:val="19"/>
-              </w:rPr>
-              <w:t>用于将 Markdown 实验报告一键转换为格式严整的交付级 Word 文档</w:t>
-            </w:r>
-          </w:p>
-        </w:tc>
-      </w:tr>
-    </w:tbl>
-    <w:p>
-      <w:pPr>
-        <w:spacing w:before="0" w:after="120"/>
-      </w:pPr>
-    </w:p>
-    <w:p>
-      <w:pPr>
-        <w:pStyle w:val="Heading3"/>
-        <w:spacing w:before="160" w:after="80"/>
-      </w:pPr>
-      <w:r>
-        <w:rPr>
-          <w:rFonts w:ascii="Microsoft YaHei" w:hAnsi="Microsoft YaHei"/>
-          <w:b/>
-          <w:color w:val="34495E"/>
-          <w:sz w:val="24"/>
-        </w:rPr>
-        <w:t>5.3 超参数配置（Hyperparameters）</w:t>
-      </w:r>
-    </w:p>
-    <w:tbl>
-      <w:tblPr>
-        <w:tblStyle w:val="TableGrid"/>
-        <w:tblW w:type="auto" w:w="0"/>
-        <w:jc w:val="center"/>
-        <w:tblLook w:firstColumn="1" w:firstRow="1" w:lastColumn="0" w:lastRow="0" w:noHBand="0" w:noVBand="1" w:val="04A0"/>
-      </w:tblPr>
-      <w:tblGrid>
-        <w:gridCol w:w="3120"/>
-        <w:gridCol w:w="3120"/>
-        <w:gridCol w:w="3120"/>
-      </w:tblGrid>
-      <w:tr>
-        <w:tc>
-          <w:tcPr>
-            <w:tcW w:type="dxa" w:w="3120"/>
-          </w:tcPr>
-          <w:p>
-            <w:pPr>
-              <w:jc w:val="center"/>
-            </w:pPr>
-            <w:r/>
-            <w:r>
-              <w:rPr>
-                <w:rFonts w:ascii="Microsoft YaHei" w:hAnsi="Microsoft YaHei"/>
-                <w:b/>
-                <w:sz w:val="20"/>
-              </w:rPr>
-              <w:t>参数 (Hyperparameter)</w:t>
-            </w:r>
-          </w:p>
-        </w:tc>
-        <w:tc>
-          <w:tcPr>
-            <w:tcW w:type="dxa" w:w="3120"/>
-          </w:tcPr>
-          <w:p>
-            <w:pPr>
-              <w:jc w:val="center"/>
-            </w:pPr>
-            <w:r/>
-            <w:r>
-              <w:rPr>
-                <w:rFonts w:ascii="Microsoft YaHei" w:hAnsi="Microsoft YaHei"/>
-                <w:b/>
-                <w:sz w:val="20"/>
-              </w:rPr>
-              <w:t>配置值 (Config Value)</w:t>
-            </w:r>
-          </w:p>
-        </w:tc>
-        <w:tc>
-          <w:tcPr>
-            <w:tcW w:type="dxa" w:w="3120"/>
-          </w:tcPr>
-          <w:p>
-            <w:pPr>
-              <w:jc w:val="center"/>
-            </w:pPr>
-            <w:r/>
-            <w:r>
-              <w:rPr>
-                <w:rFonts w:ascii="Microsoft YaHei" w:hAnsi="Microsoft YaHei"/>
-                <w:b/>
-                <w:sz w:val="20"/>
-              </w:rPr>
-              <w:t>参数用途说明</w:t>
+              <w:t>0.05</w:t>
             </w:r>
           </w:p>
         </w:tc>
@@ -6592,7 +5914,7 @@
       <w:tr>
         <w:tc>
           <w:tcPr>
-            <w:tcW w:type="dxa" w:w="3120"/>
+            <w:tcW w:type="dxa" w:w="4680"/>
           </w:tcPr>
           <w:p>
             <w:pPr>
@@ -6610,13 +5932,13 @@
                 <w:b/>
                 <w:sz w:val="19"/>
               </w:rPr>
-              <w:t>Embedding Dim (BPR_Ultra)</w:t>
+              <w:t>LLM Candidate Size</w:t>
             </w:r>
           </w:p>
         </w:tc>
         <w:tc>
           <w:tcPr>
-            <w:tcW w:type="dxa" w:w="3120"/>
+            <w:tcW w:type="dxa" w:w="4680"/>
           </w:tcPr>
           <w:p>
             <w:pPr>
@@ -6633,30 +5955,7 @@
                 <w:rFonts w:ascii="Microsoft YaHei" w:hAnsi="Microsoft YaHei"/>
                 <w:sz w:val="19"/>
               </w:rPr>
-              <w:t>128</w:t>
-            </w:r>
-          </w:p>
-        </w:tc>
-        <w:tc>
-          <w:tcPr>
-            <w:tcW w:type="dxa" w:w="3120"/>
-          </w:tcPr>
-          <w:p>
-            <w:pPr>
-              <w:jc w:val="center"/>
-            </w:pPr>
-            <w:r>
-              <w:rPr>
-                <w:rFonts w:ascii="Microsoft YaHei" w:hAnsi="Microsoft YaHei"/>
-                <w:sz w:val="19"/>
-              </w:rPr>
-            </w:r>
-            <w:r>
-              <w:rPr>
-                <w:rFonts w:ascii="Microsoft YaHei" w:hAnsi="Microsoft YaHei"/>
-                <w:sz w:val="19"/>
-              </w:rPr>
-              <w:t>BPR_Ultra 的隐空间维度（网格搜索最优）</w:t>
+              <w:t>50</w:t>
             </w:r>
           </w:p>
         </w:tc>
@@ -6664,7 +5963,7 @@
       <w:tr>
         <w:tc>
           <w:tcPr>
-            <w:tcW w:type="dxa" w:w="3120"/>
+            <w:tcW w:type="dxa" w:w="4680"/>
           </w:tcPr>
           <w:p>
             <w:pPr>
@@ -6682,13 +5981,13 @@
                 <w:b/>
                 <w:sz w:val="19"/>
               </w:rPr>
-              <w:t>BPR_Ultra Batch Size</w:t>
+              <w:t>LLM Model API</w:t>
             </w:r>
           </w:p>
         </w:tc>
         <w:tc>
           <w:tcPr>
-            <w:tcW w:type="dxa" w:w="3120"/>
+            <w:tcW w:type="dxa" w:w="4680"/>
           </w:tcPr>
           <w:p>
             <w:pPr>
@@ -6705,30 +6004,7 @@
                 <w:rFonts w:ascii="Microsoft YaHei" w:hAnsi="Microsoft YaHei"/>
                 <w:sz w:val="19"/>
               </w:rPr>
-              <w:t>16384</w:t>
-            </w:r>
-          </w:p>
-        </w:tc>
-        <w:tc>
-          <w:tcPr>
-            <w:tcW w:type="dxa" w:w="3120"/>
-          </w:tcPr>
-          <w:p>
-            <w:pPr>
-              <w:jc w:val="center"/>
-            </w:pPr>
-            <w:r>
-              <w:rPr>
-                <w:rFonts w:ascii="Microsoft YaHei" w:hAnsi="Microsoft YaHei"/>
-                <w:sz w:val="19"/>
-              </w:rPr>
-            </w:r>
-            <w:r>
-              <w:rPr>
-                <w:rFonts w:ascii="Microsoft YaHei" w:hAnsi="Microsoft YaHei"/>
-                <w:sz w:val="19"/>
-              </w:rPr>
-              <w:t>V100 GPU 最优批大小</w:t>
+              <w:t>`deepseek-v4-flash`</w:t>
             </w:r>
           </w:p>
         </w:tc>
@@ -6736,7 +6012,7 @@
       <w:tr>
         <w:tc>
           <w:tcPr>
-            <w:tcW w:type="dxa" w:w="3120"/>
+            <w:tcW w:type="dxa" w:w="4680"/>
           </w:tcPr>
           <w:p>
             <w:pPr>
@@ -6754,13 +6030,13 @@
                 <w:b/>
                 <w:sz w:val="19"/>
               </w:rPr>
-              <w:t>BPR_Ultra Learning Rate</w:t>
+              <w:t>Top-K</w:t>
             </w:r>
           </w:p>
         </w:tc>
         <w:tc>
           <w:tcPr>
-            <w:tcW w:type="dxa" w:w="3120"/>
+            <w:tcW w:type="dxa" w:w="4680"/>
           </w:tcPr>
           <w:p>
             <w:pPr>
@@ -6777,390 +6053,7 @@
                 <w:rFonts w:ascii="Microsoft YaHei" w:hAnsi="Microsoft YaHei"/>
                 <w:sz w:val="19"/>
               </w:rPr>
-              <w:t>2e-3 (AdamW)</w:t>
-            </w:r>
-          </w:p>
-        </w:tc>
-        <w:tc>
-          <w:tcPr>
-            <w:tcW w:type="dxa" w:w="3120"/>
-          </w:tcPr>
-          <w:p>
-            <w:pPr>
-              <w:jc w:val="center"/>
-            </w:pPr>
-            <w:r>
-              <w:rPr>
-                <w:rFonts w:ascii="Microsoft YaHei" w:hAnsi="Microsoft YaHei"/>
-                <w:sz w:val="19"/>
-              </w:rPr>
-            </w:r>
-            <w:r>
-              <w:rPr>
-                <w:rFonts w:ascii="Microsoft YaHei" w:hAnsi="Microsoft YaHei"/>
-                <w:sz w:val="19"/>
-              </w:rPr>
-              <w:t>网格搜索最优学习率，比默认提高一倍</w:t>
-            </w:r>
-          </w:p>
-        </w:tc>
-      </w:tr>
-      <w:tr>
-        <w:tc>
-          <w:tcPr>
-            <w:tcW w:type="dxa" w:w="3120"/>
-          </w:tcPr>
-          <w:p>
-            <w:pPr>
-              <w:jc w:val="left"/>
-            </w:pPr>
-            <w:r>
-              <w:rPr>
-                <w:rFonts w:ascii="Microsoft YaHei" w:hAnsi="Microsoft YaHei"/>
-                <w:sz w:val="19"/>
-              </w:rPr>
-            </w:r>
-            <w:r>
-              <w:rPr>
-                <w:rFonts w:ascii="Microsoft YaHei" w:hAnsi="Microsoft YaHei"/>
-                <w:b/>
-                <w:sz w:val="19"/>
-              </w:rPr>
-              <w:t>BPR_Ultra Negative K</w:t>
-            </w:r>
-          </w:p>
-        </w:tc>
-        <w:tc>
-          <w:tcPr>
-            <w:tcW w:type="dxa" w:w="3120"/>
-          </w:tcPr>
-          <w:p>
-            <w:pPr>
-              <w:jc w:val="center"/>
-            </w:pPr>
-            <w:r>
-              <w:rPr>
-                <w:rFonts w:ascii="Microsoft YaHei" w:hAnsi="Microsoft YaHei"/>
-                <w:sz w:val="19"/>
-              </w:rPr>
-            </w:r>
-            <w:r>
-              <w:rPr>
-                <w:rFonts w:ascii="Microsoft YaHei" w:hAnsi="Microsoft YaHei"/>
-                <w:sz w:val="19"/>
-              </w:rPr>
-              <w:t>5</w:t>
-            </w:r>
-          </w:p>
-        </w:tc>
-        <w:tc>
-          <w:tcPr>
-            <w:tcW w:type="dxa" w:w="3120"/>
-          </w:tcPr>
-          <w:p>
-            <w:pPr>
-              <w:jc w:val="center"/>
-            </w:pPr>
-            <w:r>
-              <w:rPr>
-                <w:rFonts w:ascii="Microsoft YaHei" w:hAnsi="Microsoft YaHei"/>
-                <w:sz w:val="19"/>
-              </w:rPr>
-            </w:r>
-            <w:r>
-              <w:rPr>
-                <w:rFonts w:ascii="Microsoft YaHei" w:hAnsi="Microsoft YaHei"/>
-                <w:sz w:val="19"/>
-              </w:rPr>
-              <w:t>每正样本配 5 个随机负样本</w:t>
-            </w:r>
-          </w:p>
-        </w:tc>
-      </w:tr>
-      <w:tr>
-        <w:tc>
-          <w:tcPr>
-            <w:tcW w:type="dxa" w:w="3120"/>
-          </w:tcPr>
-          <w:p>
-            <w:pPr>
-              <w:jc w:val="left"/>
-            </w:pPr>
-            <w:r>
-              <w:rPr>
-                <w:rFonts w:ascii="Microsoft YaHei" w:hAnsi="Microsoft YaHei"/>
-                <w:sz w:val="19"/>
-              </w:rPr>
-            </w:r>
-            <w:r>
-              <w:rPr>
-                <w:rFonts w:ascii="Microsoft YaHei" w:hAnsi="Microsoft YaHei"/>
-                <w:b/>
-                <w:sz w:val="19"/>
-              </w:rPr>
-              <w:t>BPR_Ultra Dropout</w:t>
-            </w:r>
-          </w:p>
-        </w:tc>
-        <w:tc>
-          <w:tcPr>
-            <w:tcW w:type="dxa" w:w="3120"/>
-          </w:tcPr>
-          <w:p>
-            <w:pPr>
-              <w:jc w:val="center"/>
-            </w:pPr>
-            <w:r>
-              <w:rPr>
-                <w:rFonts w:ascii="Microsoft YaHei" w:hAnsi="Microsoft YaHei"/>
-                <w:sz w:val="19"/>
-              </w:rPr>
-            </w:r>
-            <w:r>
-              <w:rPr>
-                <w:rFonts w:ascii="Microsoft YaHei" w:hAnsi="Microsoft YaHei"/>
-                <w:sz w:val="19"/>
-              </w:rPr>
-              <w:t>0.05</w:t>
-            </w:r>
-          </w:p>
-        </w:tc>
-        <w:tc>
-          <w:tcPr>
-            <w:tcW w:type="dxa" w:w="3120"/>
-          </w:tcPr>
-          <w:p>
-            <w:pPr>
-              <w:jc w:val="center"/>
-            </w:pPr>
-            <w:r>
-              <w:rPr>
-                <w:rFonts w:ascii="Microsoft YaHei" w:hAnsi="Microsoft YaHei"/>
-                <w:sz w:val="19"/>
-              </w:rPr>
-            </w:r>
-            <w:r>
-              <w:rPr>
-                <w:rFonts w:ascii="Microsoft YaHei" w:hAnsi="Microsoft YaHei"/>
-                <w:sz w:val="19"/>
-              </w:rPr>
-              <w:t>物品嵌入层 5% Dropout 正则化</w:t>
-            </w:r>
-          </w:p>
-        </w:tc>
-      </w:tr>
-      <w:tr>
-        <w:tc>
-          <w:tcPr>
-            <w:tcW w:type="dxa" w:w="3120"/>
-          </w:tcPr>
-          <w:p>
-            <w:pPr>
-              <w:jc w:val="left"/>
-            </w:pPr>
-            <w:r>
-              <w:rPr>
-                <w:rFonts w:ascii="Microsoft YaHei" w:hAnsi="Microsoft YaHei"/>
-                <w:sz w:val="19"/>
-              </w:rPr>
-            </w:r>
-            <w:r>
-              <w:rPr>
-                <w:rFonts w:ascii="Microsoft YaHei" w:hAnsi="Microsoft YaHei"/>
-                <w:b/>
-                <w:sz w:val="19"/>
-              </w:rPr>
-              <w:t>LLM Candidate Size (候选集大小)</w:t>
-            </w:r>
-          </w:p>
-        </w:tc>
-        <w:tc>
-          <w:tcPr>
-            <w:tcW w:type="dxa" w:w="3120"/>
-          </w:tcPr>
-          <w:p>
-            <w:pPr>
-              <w:jc w:val="center"/>
-            </w:pPr>
-            <w:r>
-              <w:rPr>
-                <w:rFonts w:ascii="Microsoft YaHei" w:hAnsi="Microsoft YaHei"/>
-                <w:sz w:val="19"/>
-              </w:rPr>
-            </w:r>
-            <w:r>
-              <w:rPr>
-                <w:rFonts w:ascii="Microsoft YaHei" w:hAnsi="Microsoft YaHei"/>
-                <w:sz w:val="19"/>
-              </w:rPr>
-              <w:t>50</w:t>
-            </w:r>
-          </w:p>
-        </w:tc>
-        <w:tc>
-          <w:tcPr>
-            <w:tcW w:type="dxa" w:w="3120"/>
-          </w:tcPr>
-          <w:p>
-            <w:pPr>
-              <w:jc w:val="center"/>
-            </w:pPr>
-            <w:r>
-              <w:rPr>
-                <w:rFonts w:ascii="Microsoft YaHei" w:hAnsi="Microsoft YaHei"/>
-                <w:sz w:val="19"/>
-              </w:rPr>
-            </w:r>
-            <w:r>
-              <w:rPr>
-                <w:rFonts w:ascii="Microsoft YaHei" w:hAnsi="Microsoft YaHei"/>
-                <w:sz w:val="19"/>
-              </w:rPr>
-              <w:t>从传统模型初筛出的、供大模型细排的候选池大小</w:t>
-            </w:r>
-          </w:p>
-        </w:tc>
-      </w:tr>
-      <w:tr>
-        <w:tc>
-          <w:tcPr>
-            <w:tcW w:type="dxa" w:w="3120"/>
-          </w:tcPr>
-          <w:p>
-            <w:pPr>
-              <w:jc w:val="left"/>
-            </w:pPr>
-            <w:r>
-              <w:rPr>
-                <w:rFonts w:ascii="Microsoft YaHei" w:hAnsi="Microsoft YaHei"/>
-                <w:sz w:val="19"/>
-              </w:rPr>
-            </w:r>
-            <w:r>
-              <w:rPr>
-                <w:rFonts w:ascii="Microsoft YaHei" w:hAnsi="Microsoft YaHei"/>
-                <w:b/>
-                <w:sz w:val="19"/>
-              </w:rPr>
-              <w:t>LLM Model API</w:t>
-            </w:r>
-          </w:p>
-        </w:tc>
-        <w:tc>
-          <w:tcPr>
-            <w:tcW w:type="dxa" w:w="3120"/>
-          </w:tcPr>
-          <w:p>
-            <w:pPr>
-              <w:jc w:val="center"/>
-            </w:pPr>
-            <w:r>
-              <w:rPr>
-                <w:rFonts w:ascii="Microsoft YaHei" w:hAnsi="Microsoft YaHei"/>
-                <w:sz w:val="19"/>
-              </w:rPr>
-            </w:r>
-            <w:r>
-              <w:rPr>
-                <w:rFonts w:ascii="Microsoft YaHei" w:hAnsi="Microsoft YaHei"/>
-                <w:sz w:val="19"/>
-              </w:rPr>
-              <w:t>`deepseek-v4-flash`</w:t>
-            </w:r>
-          </w:p>
-        </w:tc>
-        <w:tc>
-          <w:tcPr>
-            <w:tcW w:type="dxa" w:w="3120"/>
-          </w:tcPr>
-          <w:p>
-            <w:pPr>
-              <w:jc w:val="center"/>
-            </w:pPr>
-            <w:r>
-              <w:rPr>
-                <w:rFonts w:ascii="Microsoft YaHei" w:hAnsi="Microsoft YaHei"/>
-                <w:sz w:val="19"/>
-              </w:rPr>
-            </w:r>
-            <w:r>
-              <w:rPr>
-                <w:rFonts w:ascii="Microsoft YaHei" w:hAnsi="Microsoft YaHei"/>
-                <w:sz w:val="19"/>
-              </w:rPr>
-              <w:t>DeepSeek 核心推理及常识库重排序模型接口</w:t>
-            </w:r>
-          </w:p>
-        </w:tc>
-      </w:tr>
-      <w:tr>
-        <w:tc>
-          <w:tcPr>
-            <w:tcW w:type="dxa" w:w="3120"/>
-          </w:tcPr>
-          <w:p>
-            <w:pPr>
-              <w:jc w:val="left"/>
-            </w:pPr>
-            <w:r>
-              <w:rPr>
-                <w:rFonts w:ascii="Microsoft YaHei" w:hAnsi="Microsoft YaHei"/>
-                <w:sz w:val="19"/>
-              </w:rPr>
-            </w:r>
-            <w:r>
-              <w:rPr>
-                <w:rFonts w:ascii="Microsoft YaHei" w:hAnsi="Microsoft YaHei"/>
-                <w:b/>
-                <w:sz w:val="19"/>
-              </w:rPr>
-              <w:t>Top-K (推荐输出大小)</w:t>
-            </w:r>
-          </w:p>
-        </w:tc>
-        <w:tc>
-          <w:tcPr>
-            <w:tcW w:type="dxa" w:w="3120"/>
-          </w:tcPr>
-          <w:p>
-            <w:pPr>
-              <w:jc w:val="center"/>
-            </w:pPr>
-            <w:r>
-              <w:rPr>
-                <w:rFonts w:ascii="Microsoft YaHei" w:hAnsi="Microsoft YaHei"/>
-                <w:sz w:val="19"/>
-              </w:rPr>
-            </w:r>
-            <w:r>
-              <w:rPr>
-                <w:rFonts w:ascii="Microsoft YaHei" w:hAnsi="Microsoft YaHei"/>
-                <w:sz w:val="19"/>
-              </w:rPr>
               <w:t>10</w:t>
-            </w:r>
-          </w:p>
-        </w:tc>
-        <w:tc>
-          <w:tcPr>
-            <w:tcW w:type="dxa" w:w="3120"/>
-          </w:tcPr>
-          <w:p>
-            <w:pPr>
-              <w:jc w:val="center"/>
-            </w:pPr>
-            <w:r>
-              <w:rPr>
-                <w:rFonts w:ascii="Microsoft YaHei" w:hAnsi="Microsoft YaHei"/>
-                <w:sz w:val="19"/>
-              </w:rPr>
-            </w:r>
-            <w:r>
-              <w:rPr>
-                <w:rFonts w:ascii="Microsoft YaHei" w:hAnsi="Microsoft YaHei"/>
-                <w:sz w:val="19"/>
-              </w:rPr>
-              <w:t>最终呈现并计算学术命中率指标的 Top-K 大小</w:t>
             </w:r>
           </w:p>
         </w:tc>
@@ -7209,11 +6102,11 @@
         <w:br/>
         <w:t>├── CDs_and_Vinyl_SASRec_model.pt                   # SASRec 模型权重 (CDs)</w:t>
         <w:br/>
-        <w:t>├── Industrial_and_Scientific_BPR_Ultra_Final_model.pt  # BPR_Ultra 最优模型 🚀</w:t>
+        <w:t>├── Industrial_and_Scientific_BPR_Ultra_Final_model.pt  # BPR 最优模型 🚀</w:t>
         <w:br/>
-        <w:t>├── Musical_Instruments_BPR_Ultra_Final_model.pt        # BPR_Ultra 最优模型 🚀</w:t>
+        <w:t>├── Musical_Instruments_BPR_Ultra_Final_model.pt        # BPR 最优模型 🚀</w:t>
         <w:br/>
-        <w:t>└── CDs_and_Vinyl_BPR_Ultra_Final_model.pt              # BPR_Ultra 最优模型 🚀</w:t>
+        <w:t>└── CDs_and_Vinyl_BPR_Ultra_Final_model.pt              # BPR 最优模型 🚀</w:t>
         <w:br/>
         <w:br/>
         <w:t>src/</w:t>
@@ -7232,9 +6125,9 @@
         <w:br/>
         <w:t>│   ├── item_cf.py     # ItemCF Recommender</w:t>
         <w:br/>
-        <w:t>│   ├── bpr.py         # Bayesian Personalized Ranking Recommender</w:t>
+        <w:t>│   ├── bpr.py         # BPR 矩阵分解排序模型</w:t>
         <w:br/>
-        <w:t>│   ├── bpr_ultra.py   # BPR_Ultra 网格搜索最优超参模型 🚀 [SOTA]</w:t>
+        <w:t>│   ├── bpr_ultra.py   # BPR 优化模型 🚀 [SOTA]</w:t>
         <w:br/>
         <w:t>│   └── sasrec.py      # 自注意力时序 Transformer 推荐模型</w:t>
         <w:br/>

</xml_diff>

<commit_message>
Add team member info to report
</commit_message>
<xml_diff>
--- a/实验报告.docx
+++ b/实验报告.docx
@@ -17,6 +17,460 @@
         </w:rPr>
         <w:t>推荐系统大作业实验报告</w:t>
       </w:r>
+    </w:p>
+    <w:p>
+      <w:pPr>
+        <w:spacing w:before="80" w:after="120" w:line="276" w:lineRule="auto"/>
+      </w:pPr>
+      <w:r>
+        <w:rPr>
+          <w:rFonts w:ascii="Microsoft YaHei" w:hAnsi="Microsoft YaHei"/>
+          <w:b/>
+          <w:sz w:val="21"/>
+        </w:rPr>
+        <w:t>小组成员：</w:t>
+      </w:r>
+    </w:p>
+    <w:tbl>
+      <w:tblPr>
+        <w:tblStyle w:val="TableGrid"/>
+        <w:tblW w:type="auto" w:w="0"/>
+        <w:jc w:val="center"/>
+        <w:tblLook w:firstColumn="1" w:firstRow="1" w:lastColumn="0" w:lastRow="0" w:noHBand="0" w:noVBand="1" w:val="04A0"/>
+      </w:tblPr>
+      <w:tblGrid>
+        <w:gridCol w:w="4680"/>
+        <w:gridCol w:w="4680"/>
+      </w:tblGrid>
+      <w:tr>
+        <w:tc>
+          <w:tcPr>
+            <w:tcW w:type="dxa" w:w="4680"/>
+          </w:tcPr>
+          <w:p>
+            <w:pPr>
+              <w:jc w:val="center"/>
+            </w:pPr>
+            <w:r/>
+            <w:r>
+              <w:rPr>
+                <w:rFonts w:ascii="Microsoft YaHei" w:hAnsi="Microsoft YaHei"/>
+                <w:b/>
+                <w:sz w:val="20"/>
+              </w:rPr>
+              <w:t>姓名</w:t>
+            </w:r>
+          </w:p>
+        </w:tc>
+        <w:tc>
+          <w:tcPr>
+            <w:tcW w:type="dxa" w:w="4680"/>
+          </w:tcPr>
+          <w:p>
+            <w:pPr>
+              <w:jc w:val="center"/>
+            </w:pPr>
+            <w:r/>
+            <w:r>
+              <w:rPr>
+                <w:rFonts w:ascii="Microsoft YaHei" w:hAnsi="Microsoft YaHei"/>
+                <w:b/>
+                <w:sz w:val="20"/>
+              </w:rPr>
+              <w:t>学号</w:t>
+            </w:r>
+          </w:p>
+        </w:tc>
+      </w:tr>
+      <w:tr>
+        <w:tc>
+          <w:tcPr>
+            <w:tcW w:type="dxa" w:w="4680"/>
+          </w:tcPr>
+          <w:p>
+            <w:pPr>
+              <w:jc w:val="left"/>
+            </w:pPr>
+            <w:r>
+              <w:rPr>
+                <w:rFonts w:ascii="Microsoft YaHei" w:hAnsi="Microsoft YaHei"/>
+                <w:sz w:val="19"/>
+              </w:rPr>
+            </w:r>
+            <w:r>
+              <w:rPr>
+                <w:rFonts w:ascii="Microsoft YaHei" w:hAnsi="Microsoft YaHei"/>
+                <w:sz w:val="19"/>
+              </w:rPr>
+              <w:t>陈润琛</w:t>
+            </w:r>
+          </w:p>
+        </w:tc>
+        <w:tc>
+          <w:tcPr>
+            <w:tcW w:type="dxa" w:w="4680"/>
+          </w:tcPr>
+          <w:p>
+            <w:pPr>
+              <w:jc w:val="center"/>
+            </w:pPr>
+            <w:r>
+              <w:rPr>
+                <w:rFonts w:ascii="Microsoft YaHei" w:hAnsi="Microsoft YaHei"/>
+                <w:sz w:val="19"/>
+              </w:rPr>
+            </w:r>
+            <w:r>
+              <w:rPr>
+                <w:rFonts w:ascii="Microsoft YaHei" w:hAnsi="Microsoft YaHei"/>
+                <w:sz w:val="19"/>
+              </w:rPr>
+              <w:t>2025E8007382017</w:t>
+            </w:r>
+          </w:p>
+        </w:tc>
+      </w:tr>
+      <w:tr>
+        <w:tc>
+          <w:tcPr>
+            <w:tcW w:type="dxa" w:w="4680"/>
+          </w:tcPr>
+          <w:p>
+            <w:pPr>
+              <w:jc w:val="left"/>
+            </w:pPr>
+            <w:r>
+              <w:rPr>
+                <w:rFonts w:ascii="Microsoft YaHei" w:hAnsi="Microsoft YaHei"/>
+                <w:sz w:val="19"/>
+              </w:rPr>
+            </w:r>
+            <w:r>
+              <w:rPr>
+                <w:rFonts w:ascii="Microsoft YaHei" w:hAnsi="Microsoft YaHei"/>
+                <w:sz w:val="19"/>
+              </w:rPr>
+              <w:t>贾锦成</w:t>
+            </w:r>
+          </w:p>
+        </w:tc>
+        <w:tc>
+          <w:tcPr>
+            <w:tcW w:type="dxa" w:w="4680"/>
+          </w:tcPr>
+          <w:p>
+            <w:pPr>
+              <w:jc w:val="center"/>
+            </w:pPr>
+            <w:r>
+              <w:rPr>
+                <w:rFonts w:ascii="Microsoft YaHei" w:hAnsi="Microsoft YaHei"/>
+                <w:sz w:val="19"/>
+              </w:rPr>
+            </w:r>
+            <w:r>
+              <w:rPr>
+                <w:rFonts w:ascii="Microsoft YaHei" w:hAnsi="Microsoft YaHei"/>
+                <w:sz w:val="19"/>
+              </w:rPr>
+              <w:t>2025E8007382021</w:t>
+            </w:r>
+          </w:p>
+        </w:tc>
+      </w:tr>
+      <w:tr>
+        <w:tc>
+          <w:tcPr>
+            <w:tcW w:type="dxa" w:w="4680"/>
+          </w:tcPr>
+          <w:p>
+            <w:pPr>
+              <w:jc w:val="left"/>
+            </w:pPr>
+            <w:r>
+              <w:rPr>
+                <w:rFonts w:ascii="Microsoft YaHei" w:hAnsi="Microsoft YaHei"/>
+                <w:sz w:val="19"/>
+              </w:rPr>
+            </w:r>
+            <w:r>
+              <w:rPr>
+                <w:rFonts w:ascii="Microsoft YaHei" w:hAnsi="Microsoft YaHei"/>
+                <w:sz w:val="19"/>
+              </w:rPr>
+              <w:t>刘昊安</w:t>
+            </w:r>
+          </w:p>
+        </w:tc>
+        <w:tc>
+          <w:tcPr>
+            <w:tcW w:type="dxa" w:w="4680"/>
+          </w:tcPr>
+          <w:p>
+            <w:pPr>
+              <w:jc w:val="center"/>
+            </w:pPr>
+            <w:r>
+              <w:rPr>
+                <w:rFonts w:ascii="Microsoft YaHei" w:hAnsi="Microsoft YaHei"/>
+                <w:sz w:val="19"/>
+              </w:rPr>
+            </w:r>
+            <w:r>
+              <w:rPr>
+                <w:rFonts w:ascii="Microsoft YaHei" w:hAnsi="Microsoft YaHei"/>
+                <w:sz w:val="19"/>
+              </w:rPr>
+              <w:t>2025E8007382033</w:t>
+            </w:r>
+          </w:p>
+        </w:tc>
+      </w:tr>
+      <w:tr>
+        <w:tc>
+          <w:tcPr>
+            <w:tcW w:type="dxa" w:w="4680"/>
+          </w:tcPr>
+          <w:p>
+            <w:pPr>
+              <w:jc w:val="left"/>
+            </w:pPr>
+            <w:r>
+              <w:rPr>
+                <w:rFonts w:ascii="Microsoft YaHei" w:hAnsi="Microsoft YaHei"/>
+                <w:sz w:val="19"/>
+              </w:rPr>
+            </w:r>
+            <w:r>
+              <w:rPr>
+                <w:rFonts w:ascii="Microsoft YaHei" w:hAnsi="Microsoft YaHei"/>
+                <w:sz w:val="19"/>
+              </w:rPr>
+              <w:t>严锦濛</w:t>
+            </w:r>
+          </w:p>
+        </w:tc>
+        <w:tc>
+          <w:tcPr>
+            <w:tcW w:type="dxa" w:w="4680"/>
+          </w:tcPr>
+          <w:p>
+            <w:pPr>
+              <w:jc w:val="center"/>
+            </w:pPr>
+            <w:r>
+              <w:rPr>
+                <w:rFonts w:ascii="Microsoft YaHei" w:hAnsi="Microsoft YaHei"/>
+                <w:sz w:val="19"/>
+              </w:rPr>
+            </w:r>
+            <w:r>
+              <w:rPr>
+                <w:rFonts w:ascii="Microsoft YaHei" w:hAnsi="Microsoft YaHei"/>
+                <w:sz w:val="19"/>
+              </w:rPr>
+              <w:t>2025E8007382005</w:t>
+            </w:r>
+          </w:p>
+        </w:tc>
+      </w:tr>
+      <w:tr>
+        <w:tc>
+          <w:tcPr>
+            <w:tcW w:type="dxa" w:w="4680"/>
+          </w:tcPr>
+          <w:p>
+            <w:pPr>
+              <w:jc w:val="left"/>
+            </w:pPr>
+            <w:r>
+              <w:rPr>
+                <w:rFonts w:ascii="Microsoft YaHei" w:hAnsi="Microsoft YaHei"/>
+                <w:sz w:val="19"/>
+              </w:rPr>
+            </w:r>
+            <w:r>
+              <w:rPr>
+                <w:rFonts w:ascii="Microsoft YaHei" w:hAnsi="Microsoft YaHei"/>
+                <w:sz w:val="19"/>
+              </w:rPr>
+              <w:t>童杰</w:t>
+            </w:r>
+          </w:p>
+        </w:tc>
+        <w:tc>
+          <w:tcPr>
+            <w:tcW w:type="dxa" w:w="4680"/>
+          </w:tcPr>
+          <w:p>
+            <w:pPr>
+              <w:jc w:val="center"/>
+            </w:pPr>
+            <w:r>
+              <w:rPr>
+                <w:rFonts w:ascii="Microsoft YaHei" w:hAnsi="Microsoft YaHei"/>
+                <w:sz w:val="19"/>
+              </w:rPr>
+            </w:r>
+            <w:r>
+              <w:rPr>
+                <w:rFonts w:ascii="Microsoft YaHei" w:hAnsi="Microsoft YaHei"/>
+                <w:sz w:val="19"/>
+              </w:rPr>
+              <w:t>2025E8007382036</w:t>
+            </w:r>
+          </w:p>
+        </w:tc>
+      </w:tr>
+      <w:tr>
+        <w:tc>
+          <w:tcPr>
+            <w:tcW w:type="dxa" w:w="4680"/>
+          </w:tcPr>
+          <w:p>
+            <w:pPr>
+              <w:jc w:val="left"/>
+            </w:pPr>
+            <w:r>
+              <w:rPr>
+                <w:rFonts w:ascii="Microsoft YaHei" w:hAnsi="Microsoft YaHei"/>
+                <w:sz w:val="19"/>
+              </w:rPr>
+            </w:r>
+            <w:r>
+              <w:rPr>
+                <w:rFonts w:ascii="Microsoft YaHei" w:hAnsi="Microsoft YaHei"/>
+                <w:sz w:val="19"/>
+              </w:rPr>
+              <w:t>卜绍峰</w:t>
+            </w:r>
+          </w:p>
+        </w:tc>
+        <w:tc>
+          <w:tcPr>
+            <w:tcW w:type="dxa" w:w="4680"/>
+          </w:tcPr>
+          <w:p>
+            <w:pPr>
+              <w:jc w:val="center"/>
+            </w:pPr>
+            <w:r>
+              <w:rPr>
+                <w:rFonts w:ascii="Microsoft YaHei" w:hAnsi="Microsoft YaHei"/>
+                <w:sz w:val="19"/>
+              </w:rPr>
+            </w:r>
+            <w:r>
+              <w:rPr>
+                <w:rFonts w:ascii="Microsoft YaHei" w:hAnsi="Microsoft YaHei"/>
+                <w:sz w:val="19"/>
+              </w:rPr>
+              <w:t>2023E8007382004</w:t>
+            </w:r>
+          </w:p>
+        </w:tc>
+      </w:tr>
+      <w:tr>
+        <w:tc>
+          <w:tcPr>
+            <w:tcW w:type="dxa" w:w="4680"/>
+          </w:tcPr>
+          <w:p>
+            <w:pPr>
+              <w:jc w:val="left"/>
+            </w:pPr>
+            <w:r>
+              <w:rPr>
+                <w:rFonts w:ascii="Microsoft YaHei" w:hAnsi="Microsoft YaHei"/>
+                <w:sz w:val="19"/>
+              </w:rPr>
+            </w:r>
+            <w:r>
+              <w:rPr>
+                <w:rFonts w:ascii="Microsoft YaHei" w:hAnsi="Microsoft YaHei"/>
+                <w:sz w:val="19"/>
+              </w:rPr>
+              <w:t>李焕然</w:t>
+            </w:r>
+          </w:p>
+        </w:tc>
+        <w:tc>
+          <w:tcPr>
+            <w:tcW w:type="dxa" w:w="4680"/>
+          </w:tcPr>
+          <w:p>
+            <w:pPr>
+              <w:jc w:val="center"/>
+            </w:pPr>
+            <w:r>
+              <w:rPr>
+                <w:rFonts w:ascii="Microsoft YaHei" w:hAnsi="Microsoft YaHei"/>
+                <w:sz w:val="19"/>
+              </w:rPr>
+            </w:r>
+            <w:r>
+              <w:rPr>
+                <w:rFonts w:ascii="Microsoft YaHei" w:hAnsi="Microsoft YaHei"/>
+                <w:sz w:val="19"/>
+              </w:rPr>
+              <w:t>2025E8007382019</w:t>
+            </w:r>
+          </w:p>
+        </w:tc>
+      </w:tr>
+      <w:tr>
+        <w:tc>
+          <w:tcPr>
+            <w:tcW w:type="dxa" w:w="4680"/>
+          </w:tcPr>
+          <w:p>
+            <w:pPr>
+              <w:jc w:val="left"/>
+            </w:pPr>
+            <w:r>
+              <w:rPr>
+                <w:rFonts w:ascii="Microsoft YaHei" w:hAnsi="Microsoft YaHei"/>
+                <w:sz w:val="19"/>
+              </w:rPr>
+            </w:r>
+            <w:r>
+              <w:rPr>
+                <w:rFonts w:ascii="Microsoft YaHei" w:hAnsi="Microsoft YaHei"/>
+                <w:sz w:val="19"/>
+              </w:rPr>
+              <w:t>张鑫月</w:t>
+            </w:r>
+          </w:p>
+        </w:tc>
+        <w:tc>
+          <w:tcPr>
+            <w:tcW w:type="dxa" w:w="4680"/>
+          </w:tcPr>
+          <w:p>
+            <w:pPr>
+              <w:jc w:val="center"/>
+            </w:pPr>
+            <w:r>
+              <w:rPr>
+                <w:rFonts w:ascii="Microsoft YaHei" w:hAnsi="Microsoft YaHei"/>
+                <w:sz w:val="19"/>
+              </w:rPr>
+            </w:r>
+            <w:r>
+              <w:rPr>
+                <w:rFonts w:ascii="Microsoft YaHei" w:hAnsi="Microsoft YaHei"/>
+                <w:sz w:val="19"/>
+              </w:rPr>
+              <w:t>2025E8007382008</w:t>
+            </w:r>
+          </w:p>
+        </w:tc>
+      </w:tr>
+    </w:tbl>
+    <w:p>
+      <w:pPr>
+        <w:spacing w:before="0" w:after="120"/>
+      </w:pPr>
     </w:p>
     <w:p>
       <w:pPr>

</xml_diff>

<commit_message>
Remove personal info from report
</commit_message>
<xml_diff>
--- a/实验报告.docx
+++ b/实验报告.docx
@@ -17,460 +17,6 @@
         </w:rPr>
         <w:t>推荐系统大作业实验报告</w:t>
       </w:r>
-    </w:p>
-    <w:p>
-      <w:pPr>
-        <w:spacing w:before="80" w:after="120" w:line="276" w:lineRule="auto"/>
-      </w:pPr>
-      <w:r>
-        <w:rPr>
-          <w:rFonts w:ascii="Microsoft YaHei" w:hAnsi="Microsoft YaHei"/>
-          <w:b/>
-          <w:sz w:val="21"/>
-        </w:rPr>
-        <w:t>小组成员：</w:t>
-      </w:r>
-    </w:p>
-    <w:tbl>
-      <w:tblPr>
-        <w:tblStyle w:val="TableGrid"/>
-        <w:tblW w:type="auto" w:w="0"/>
-        <w:jc w:val="center"/>
-        <w:tblLook w:firstColumn="1" w:firstRow="1" w:lastColumn="0" w:lastRow="0" w:noHBand="0" w:noVBand="1" w:val="04A0"/>
-      </w:tblPr>
-      <w:tblGrid>
-        <w:gridCol w:w="4680"/>
-        <w:gridCol w:w="4680"/>
-      </w:tblGrid>
-      <w:tr>
-        <w:tc>
-          <w:tcPr>
-            <w:tcW w:type="dxa" w:w="4680"/>
-          </w:tcPr>
-          <w:p>
-            <w:pPr>
-              <w:jc w:val="center"/>
-            </w:pPr>
-            <w:r/>
-            <w:r>
-              <w:rPr>
-                <w:rFonts w:ascii="Microsoft YaHei" w:hAnsi="Microsoft YaHei"/>
-                <w:b/>
-                <w:sz w:val="20"/>
-              </w:rPr>
-              <w:t>姓名</w:t>
-            </w:r>
-          </w:p>
-        </w:tc>
-        <w:tc>
-          <w:tcPr>
-            <w:tcW w:type="dxa" w:w="4680"/>
-          </w:tcPr>
-          <w:p>
-            <w:pPr>
-              <w:jc w:val="center"/>
-            </w:pPr>
-            <w:r/>
-            <w:r>
-              <w:rPr>
-                <w:rFonts w:ascii="Microsoft YaHei" w:hAnsi="Microsoft YaHei"/>
-                <w:b/>
-                <w:sz w:val="20"/>
-              </w:rPr>
-              <w:t>学号</w:t>
-            </w:r>
-          </w:p>
-        </w:tc>
-      </w:tr>
-      <w:tr>
-        <w:tc>
-          <w:tcPr>
-            <w:tcW w:type="dxa" w:w="4680"/>
-          </w:tcPr>
-          <w:p>
-            <w:pPr>
-              <w:jc w:val="left"/>
-            </w:pPr>
-            <w:r>
-              <w:rPr>
-                <w:rFonts w:ascii="Microsoft YaHei" w:hAnsi="Microsoft YaHei"/>
-                <w:sz w:val="19"/>
-              </w:rPr>
-            </w:r>
-            <w:r>
-              <w:rPr>
-                <w:rFonts w:ascii="Microsoft YaHei" w:hAnsi="Microsoft YaHei"/>
-                <w:sz w:val="19"/>
-              </w:rPr>
-              <w:t>陈润琛</w:t>
-            </w:r>
-          </w:p>
-        </w:tc>
-        <w:tc>
-          <w:tcPr>
-            <w:tcW w:type="dxa" w:w="4680"/>
-          </w:tcPr>
-          <w:p>
-            <w:pPr>
-              <w:jc w:val="center"/>
-            </w:pPr>
-            <w:r>
-              <w:rPr>
-                <w:rFonts w:ascii="Microsoft YaHei" w:hAnsi="Microsoft YaHei"/>
-                <w:sz w:val="19"/>
-              </w:rPr>
-            </w:r>
-            <w:r>
-              <w:rPr>
-                <w:rFonts w:ascii="Microsoft YaHei" w:hAnsi="Microsoft YaHei"/>
-                <w:sz w:val="19"/>
-              </w:rPr>
-              <w:t>2025E8007382017</w:t>
-            </w:r>
-          </w:p>
-        </w:tc>
-      </w:tr>
-      <w:tr>
-        <w:tc>
-          <w:tcPr>
-            <w:tcW w:type="dxa" w:w="4680"/>
-          </w:tcPr>
-          <w:p>
-            <w:pPr>
-              <w:jc w:val="left"/>
-            </w:pPr>
-            <w:r>
-              <w:rPr>
-                <w:rFonts w:ascii="Microsoft YaHei" w:hAnsi="Microsoft YaHei"/>
-                <w:sz w:val="19"/>
-              </w:rPr>
-            </w:r>
-            <w:r>
-              <w:rPr>
-                <w:rFonts w:ascii="Microsoft YaHei" w:hAnsi="Microsoft YaHei"/>
-                <w:sz w:val="19"/>
-              </w:rPr>
-              <w:t>贾锦成</w:t>
-            </w:r>
-          </w:p>
-        </w:tc>
-        <w:tc>
-          <w:tcPr>
-            <w:tcW w:type="dxa" w:w="4680"/>
-          </w:tcPr>
-          <w:p>
-            <w:pPr>
-              <w:jc w:val="center"/>
-            </w:pPr>
-            <w:r>
-              <w:rPr>
-                <w:rFonts w:ascii="Microsoft YaHei" w:hAnsi="Microsoft YaHei"/>
-                <w:sz w:val="19"/>
-              </w:rPr>
-            </w:r>
-            <w:r>
-              <w:rPr>
-                <w:rFonts w:ascii="Microsoft YaHei" w:hAnsi="Microsoft YaHei"/>
-                <w:sz w:val="19"/>
-              </w:rPr>
-              <w:t>2025E8007382021</w:t>
-            </w:r>
-          </w:p>
-        </w:tc>
-      </w:tr>
-      <w:tr>
-        <w:tc>
-          <w:tcPr>
-            <w:tcW w:type="dxa" w:w="4680"/>
-          </w:tcPr>
-          <w:p>
-            <w:pPr>
-              <w:jc w:val="left"/>
-            </w:pPr>
-            <w:r>
-              <w:rPr>
-                <w:rFonts w:ascii="Microsoft YaHei" w:hAnsi="Microsoft YaHei"/>
-                <w:sz w:val="19"/>
-              </w:rPr>
-            </w:r>
-            <w:r>
-              <w:rPr>
-                <w:rFonts w:ascii="Microsoft YaHei" w:hAnsi="Microsoft YaHei"/>
-                <w:sz w:val="19"/>
-              </w:rPr>
-              <w:t>刘昊安</w:t>
-            </w:r>
-          </w:p>
-        </w:tc>
-        <w:tc>
-          <w:tcPr>
-            <w:tcW w:type="dxa" w:w="4680"/>
-          </w:tcPr>
-          <w:p>
-            <w:pPr>
-              <w:jc w:val="center"/>
-            </w:pPr>
-            <w:r>
-              <w:rPr>
-                <w:rFonts w:ascii="Microsoft YaHei" w:hAnsi="Microsoft YaHei"/>
-                <w:sz w:val="19"/>
-              </w:rPr>
-            </w:r>
-            <w:r>
-              <w:rPr>
-                <w:rFonts w:ascii="Microsoft YaHei" w:hAnsi="Microsoft YaHei"/>
-                <w:sz w:val="19"/>
-              </w:rPr>
-              <w:t>2025E8007382033</w:t>
-            </w:r>
-          </w:p>
-        </w:tc>
-      </w:tr>
-      <w:tr>
-        <w:tc>
-          <w:tcPr>
-            <w:tcW w:type="dxa" w:w="4680"/>
-          </w:tcPr>
-          <w:p>
-            <w:pPr>
-              <w:jc w:val="left"/>
-            </w:pPr>
-            <w:r>
-              <w:rPr>
-                <w:rFonts w:ascii="Microsoft YaHei" w:hAnsi="Microsoft YaHei"/>
-                <w:sz w:val="19"/>
-              </w:rPr>
-            </w:r>
-            <w:r>
-              <w:rPr>
-                <w:rFonts w:ascii="Microsoft YaHei" w:hAnsi="Microsoft YaHei"/>
-                <w:sz w:val="19"/>
-              </w:rPr>
-              <w:t>严锦濛</w:t>
-            </w:r>
-          </w:p>
-        </w:tc>
-        <w:tc>
-          <w:tcPr>
-            <w:tcW w:type="dxa" w:w="4680"/>
-          </w:tcPr>
-          <w:p>
-            <w:pPr>
-              <w:jc w:val="center"/>
-            </w:pPr>
-            <w:r>
-              <w:rPr>
-                <w:rFonts w:ascii="Microsoft YaHei" w:hAnsi="Microsoft YaHei"/>
-                <w:sz w:val="19"/>
-              </w:rPr>
-            </w:r>
-            <w:r>
-              <w:rPr>
-                <w:rFonts w:ascii="Microsoft YaHei" w:hAnsi="Microsoft YaHei"/>
-                <w:sz w:val="19"/>
-              </w:rPr>
-              <w:t>2025E8007382005</w:t>
-            </w:r>
-          </w:p>
-        </w:tc>
-      </w:tr>
-      <w:tr>
-        <w:tc>
-          <w:tcPr>
-            <w:tcW w:type="dxa" w:w="4680"/>
-          </w:tcPr>
-          <w:p>
-            <w:pPr>
-              <w:jc w:val="left"/>
-            </w:pPr>
-            <w:r>
-              <w:rPr>
-                <w:rFonts w:ascii="Microsoft YaHei" w:hAnsi="Microsoft YaHei"/>
-                <w:sz w:val="19"/>
-              </w:rPr>
-            </w:r>
-            <w:r>
-              <w:rPr>
-                <w:rFonts w:ascii="Microsoft YaHei" w:hAnsi="Microsoft YaHei"/>
-                <w:sz w:val="19"/>
-              </w:rPr>
-              <w:t>童杰</w:t>
-            </w:r>
-          </w:p>
-        </w:tc>
-        <w:tc>
-          <w:tcPr>
-            <w:tcW w:type="dxa" w:w="4680"/>
-          </w:tcPr>
-          <w:p>
-            <w:pPr>
-              <w:jc w:val="center"/>
-            </w:pPr>
-            <w:r>
-              <w:rPr>
-                <w:rFonts w:ascii="Microsoft YaHei" w:hAnsi="Microsoft YaHei"/>
-                <w:sz w:val="19"/>
-              </w:rPr>
-            </w:r>
-            <w:r>
-              <w:rPr>
-                <w:rFonts w:ascii="Microsoft YaHei" w:hAnsi="Microsoft YaHei"/>
-                <w:sz w:val="19"/>
-              </w:rPr>
-              <w:t>2025E8007382036</w:t>
-            </w:r>
-          </w:p>
-        </w:tc>
-      </w:tr>
-      <w:tr>
-        <w:tc>
-          <w:tcPr>
-            <w:tcW w:type="dxa" w:w="4680"/>
-          </w:tcPr>
-          <w:p>
-            <w:pPr>
-              <w:jc w:val="left"/>
-            </w:pPr>
-            <w:r>
-              <w:rPr>
-                <w:rFonts w:ascii="Microsoft YaHei" w:hAnsi="Microsoft YaHei"/>
-                <w:sz w:val="19"/>
-              </w:rPr>
-            </w:r>
-            <w:r>
-              <w:rPr>
-                <w:rFonts w:ascii="Microsoft YaHei" w:hAnsi="Microsoft YaHei"/>
-                <w:sz w:val="19"/>
-              </w:rPr>
-              <w:t>卜绍峰</w:t>
-            </w:r>
-          </w:p>
-        </w:tc>
-        <w:tc>
-          <w:tcPr>
-            <w:tcW w:type="dxa" w:w="4680"/>
-          </w:tcPr>
-          <w:p>
-            <w:pPr>
-              <w:jc w:val="center"/>
-            </w:pPr>
-            <w:r>
-              <w:rPr>
-                <w:rFonts w:ascii="Microsoft YaHei" w:hAnsi="Microsoft YaHei"/>
-                <w:sz w:val="19"/>
-              </w:rPr>
-            </w:r>
-            <w:r>
-              <w:rPr>
-                <w:rFonts w:ascii="Microsoft YaHei" w:hAnsi="Microsoft YaHei"/>
-                <w:sz w:val="19"/>
-              </w:rPr>
-              <w:t>2023E8007382004</w:t>
-            </w:r>
-          </w:p>
-        </w:tc>
-      </w:tr>
-      <w:tr>
-        <w:tc>
-          <w:tcPr>
-            <w:tcW w:type="dxa" w:w="4680"/>
-          </w:tcPr>
-          <w:p>
-            <w:pPr>
-              <w:jc w:val="left"/>
-            </w:pPr>
-            <w:r>
-              <w:rPr>
-                <w:rFonts w:ascii="Microsoft YaHei" w:hAnsi="Microsoft YaHei"/>
-                <w:sz w:val="19"/>
-              </w:rPr>
-            </w:r>
-            <w:r>
-              <w:rPr>
-                <w:rFonts w:ascii="Microsoft YaHei" w:hAnsi="Microsoft YaHei"/>
-                <w:sz w:val="19"/>
-              </w:rPr>
-              <w:t>李焕然</w:t>
-            </w:r>
-          </w:p>
-        </w:tc>
-        <w:tc>
-          <w:tcPr>
-            <w:tcW w:type="dxa" w:w="4680"/>
-          </w:tcPr>
-          <w:p>
-            <w:pPr>
-              <w:jc w:val="center"/>
-            </w:pPr>
-            <w:r>
-              <w:rPr>
-                <w:rFonts w:ascii="Microsoft YaHei" w:hAnsi="Microsoft YaHei"/>
-                <w:sz w:val="19"/>
-              </w:rPr>
-            </w:r>
-            <w:r>
-              <w:rPr>
-                <w:rFonts w:ascii="Microsoft YaHei" w:hAnsi="Microsoft YaHei"/>
-                <w:sz w:val="19"/>
-              </w:rPr>
-              <w:t>2025E8007382019</w:t>
-            </w:r>
-          </w:p>
-        </w:tc>
-      </w:tr>
-      <w:tr>
-        <w:tc>
-          <w:tcPr>
-            <w:tcW w:type="dxa" w:w="4680"/>
-          </w:tcPr>
-          <w:p>
-            <w:pPr>
-              <w:jc w:val="left"/>
-            </w:pPr>
-            <w:r>
-              <w:rPr>
-                <w:rFonts w:ascii="Microsoft YaHei" w:hAnsi="Microsoft YaHei"/>
-                <w:sz w:val="19"/>
-              </w:rPr>
-            </w:r>
-            <w:r>
-              <w:rPr>
-                <w:rFonts w:ascii="Microsoft YaHei" w:hAnsi="Microsoft YaHei"/>
-                <w:sz w:val="19"/>
-              </w:rPr>
-              <w:t>张鑫月</w:t>
-            </w:r>
-          </w:p>
-        </w:tc>
-        <w:tc>
-          <w:tcPr>
-            <w:tcW w:type="dxa" w:w="4680"/>
-          </w:tcPr>
-          <w:p>
-            <w:pPr>
-              <w:jc w:val="center"/>
-            </w:pPr>
-            <w:r>
-              <w:rPr>
-                <w:rFonts w:ascii="Microsoft YaHei" w:hAnsi="Microsoft YaHei"/>
-                <w:sz w:val="19"/>
-              </w:rPr>
-            </w:r>
-            <w:r>
-              <w:rPr>
-                <w:rFonts w:ascii="Microsoft YaHei" w:hAnsi="Microsoft YaHei"/>
-                <w:sz w:val="19"/>
-              </w:rPr>
-              <w:t>2025E8007382008</w:t>
-            </w:r>
-          </w:p>
-        </w:tc>
-      </w:tr>
-    </w:tbl>
-    <w:p>
-      <w:pPr>
-        <w:spacing w:before="0" w:after="120"/>
-      </w:pPr>
     </w:p>
     <w:p>
       <w:pPr>

</xml_diff>